<commit_message>
subir fase 5, errores en documentos, crear pruebas, agregar profesor
</commit_message>
<xml_diff>
--- a/public/docs/fase4/fase4_Informe_feedback_incremento_lecciones_aprendidas_AJUPTEL.docx
+++ b/public/docs/fase4/fase4_Informe_feedback_incremento_lecciones_aprendidas_AJUPTEL.docx
@@ -406,9 +406,10 @@
     </w:p>
     <w:p>
       <w:pPr>
-        <w:pStyle w:val="BodyText"/>
+        <w:pStyle w:val="Heading2"/>
         <w:bidi w:val="0"/>
-        <w:jc w:val="start"/>
+        <w:spacing w:before="143" w:after="63"/>
+        <w:jc w:val="center"/>
         <w:rPr>
           <w:rFonts w:ascii="Arial" w:hAnsi="Arial"/>
           <w:b/>
@@ -433,109 +434,63 @@
           <w:sz w:val="22"/>
           <w:szCs w:val="22"/>
         </w:rPr>
+        <w:t>FASE 4 – FEEDBACK DEL INCREMENTO Y LECCIONES APRENDIDAS</w:t>
       </w:r>
     </w:p>
     <w:p>
       <w:pPr>
-        <w:pStyle w:val="Heading2"/>
-        <w:bidi w:val="0"/>
-        <w:spacing w:before="143" w:after="63"/>
+        <w:pStyle w:val="Normal"/>
+        <w:spacing w:lineRule="auto" w:line="240" w:before="0" w:after="0"/>
         <w:jc w:val="center"/>
         <w:rPr>
+          <w:sz w:val="24"/>
+          <w:szCs w:val="24"/>
+        </w:rPr>
+      </w:pPr>
+      <w:r>
+        <w:rPr>
           <w:rFonts w:ascii="Arial" w:hAnsi="Arial"/>
           <w:b/>
+          <w:bCs/>
           <w:i w:val="false"/>
           <w:caps w:val="false"/>
           <w:smallCaps w:val="false"/>
-          <w:color w:val="0F1115"/>
+          <w:color w:val="auto"/>
           <w:spacing w:val="0"/>
-          <w:sz w:val="22"/>
-          <w:szCs w:val="22"/>
-        </w:rPr>
-      </w:pPr>
+          <w:sz w:val="24"/>
+          <w:szCs w:val="24"/>
+        </w:rPr>
+        <w:t xml:space="preserve">SISTEMA DE INFORMACIÓN WEB RESPONSIVO CON INTEGRACIÓN DE PORTAL INFORMATIVO Y CHATBOT INTERACTIVO CON INTELIGENCIA ARTIFICIAL ORIENTADO A LA OPTIMIZACIÓN DE LA GESTIÓN DE DATOS DE LA ASOCIACIÓN CIVIL </w:t>
+      </w:r>
       <w:r>
         <w:rPr>
           <w:rFonts w:ascii="Arial" w:hAnsi="Arial"/>
           <w:b/>
+          <w:bCs/>
           <w:i w:val="false"/>
           <w:caps w:val="false"/>
           <w:smallCaps w:val="false"/>
-          <w:color w:val="0F1115"/>
+          <w:color w:val="auto"/>
           <w:spacing w:val="0"/>
           <w:sz w:val="22"/>
           <w:szCs w:val="22"/>
         </w:rPr>
-        <w:t>FASE 4 – FEEDBACK DEL INCREMENTO Y LECCIONES APRENDIDAS</w:t>
-      </w:r>
-    </w:p>
-    <w:p>
-      <w:pPr>
-        <w:pStyle w:val="Heading3"/>
-        <w:widowControl/>
-        <w:bidi w:val="0"/>
-        <w:spacing w:lineRule="atLeast" w:line="450" w:before="0" w:after="0"/>
-        <w:ind w:hanging="0" w:start="0" w:end="0"/>
-        <w:jc w:val="center"/>
+        <w:t xml:space="preserve">DE TRABAJADORES DE TELECOMUNICACIONES JUBILADOS Y PENSIONADOS DE CARABOBO </w:t>
+      </w:r>
+      <w:r>
         <w:rPr>
           <w:rFonts w:ascii="Arial" w:hAnsi="Arial"/>
           <w:b/>
+          <w:bCs/>
           <w:i w:val="false"/>
           <w:caps w:val="false"/>
           <w:smallCaps w:val="false"/>
-          <w:color w:val="0F1115"/>
+          <w:color w:val="auto"/>
           <w:spacing w:val="0"/>
-          <w:sz w:val="22"/>
-          <w:szCs w:val="22"/>
-        </w:rPr>
-      </w:pPr>
-      <w:r>
-        <w:rPr>
-          <w:rFonts w:ascii="Arial" w:hAnsi="Arial"/>
-          <w:b/>
-          <w:i w:val="false"/>
-          <w:caps w:val="false"/>
-          <w:smallCaps w:val="false"/>
-          <w:color w:val="0F1115"/>
-          <w:spacing w:val="0"/>
-          <w:sz w:val="22"/>
-          <w:szCs w:val="22"/>
-        </w:rPr>
-        <w:t xml:space="preserve">Sistema de Información Web Responsivo para la Gestión de Datos de AJUPTEL, </w:t>
-      </w:r>
-    </w:p>
-    <w:p>
-      <w:pPr>
-        <w:pStyle w:val="Heading3"/>
-        <w:widowControl/>
-        <w:bidi w:val="0"/>
-        <w:spacing w:lineRule="atLeast" w:line="450" w:before="0" w:after="0"/>
-        <w:ind w:hanging="0" w:start="0" w:end="0"/>
-        <w:jc w:val="center"/>
-        <w:rPr>
-          <w:rFonts w:ascii="Arial" w:hAnsi="Arial"/>
-          <w:b/>
-          <w:i w:val="false"/>
-          <w:caps w:val="false"/>
-          <w:smallCaps w:val="false"/>
-          <w:color w:val="0F1115"/>
-          <w:spacing w:val="0"/>
-          <w:sz w:val="22"/>
-          <w:szCs w:val="22"/>
-        </w:rPr>
-      </w:pPr>
-      <w:r>
-        <w:rPr>
-          <w:rFonts w:ascii="Arial" w:hAnsi="Arial"/>
-          <w:b/>
-          <w:i w:val="false"/>
-          <w:caps w:val="false"/>
-          <w:smallCaps w:val="false"/>
-          <w:color w:val="0F1115"/>
-          <w:spacing w:val="0"/>
-          <w:sz w:val="22"/>
-          <w:szCs w:val="22"/>
-        </w:rPr>
-        <w:t>Región Carabobo</w:t>
+          <w:sz w:val="24"/>
+          <w:szCs w:val="24"/>
+        </w:rPr>
+        <w:t>(AJUPTEL), REGIÓN CARABOBO</w:t>
       </w:r>
     </w:p>
     <w:p>
@@ -1141,7 +1096,22 @@
           <w:sz w:val="22"/>
           <w:szCs w:val="22"/>
         </w:rPr>
-        <w:t> durante el desarrollo del Sistema de Información Web Responsivo para la Gestión de Datos de AJUPTEL, Región Carabobo.</w:t>
+        <w:t xml:space="preserve"> durante el desarrollo del </w:t>
+      </w:r>
+      <w:r>
+        <w:rPr>
+          <w:rFonts w:ascii="Arial" w:hAnsi="Arial"/>
+          <w:b w:val="false"/>
+          <w:bCs w:val="false"/>
+          <w:i w:val="false"/>
+          <w:caps w:val="false"/>
+          <w:smallCaps w:val="false"/>
+          <w:color w:val="auto"/>
+          <w:spacing w:val="0"/>
+          <w:sz w:val="22"/>
+          <w:szCs w:val="22"/>
+        </w:rPr>
+        <w:t>Sistema de Información Web Responsivo con Integración de Portal Informativo y Chatbot Interactivo con Inteligencia Artificial orientado a la optimización de la gestión de datos de la AJUPTEL, Región Carabobo.</w:t>
       </w:r>
     </w:p>
     <w:p>
@@ -1854,8 +1824,8 @@
         </w:tblCellMar>
       </w:tblPr>
       <w:tblGrid>
-        <w:gridCol w:w="1757"/>
-        <w:gridCol w:w="7603"/>
+        <w:gridCol w:w="1756"/>
+        <w:gridCol w:w="7604"/>
       </w:tblGrid>
       <w:tr>
         <w:trPr>
@@ -1863,7 +1833,7 @@
         </w:trPr>
         <w:tc>
           <w:tcPr>
-            <w:tcW w:w="1757" w:type="dxa"/>
+            <w:tcW w:w="1756" w:type="dxa"/>
             <w:tcBorders>
               <w:top w:val="single" w:sz="2" w:space="0" w:color="000000"/>
               <w:start w:val="single" w:sz="2" w:space="0" w:color="000000"/>
@@ -1874,7 +1844,7 @@
           </w:tcPr>
           <w:p>
             <w:pPr>
-              <w:pStyle w:val="Ttulodelatabla"/>
+              <w:pStyle w:val="Ttulodelatablauser"/>
               <w:bidi w:val="0"/>
               <w:spacing w:lineRule="atLeast" w:line="375"/>
               <w:ind w:hanging="0" w:start="0" w:end="0"/>
@@ -1905,7 +1875,7 @@
         </w:tc>
         <w:tc>
           <w:tcPr>
-            <w:tcW w:w="7603" w:type="dxa"/>
+            <w:tcW w:w="7604" w:type="dxa"/>
             <w:tcBorders>
               <w:top w:val="single" w:sz="2" w:space="0" w:color="000000"/>
               <w:start w:val="single" w:sz="2" w:space="0" w:color="000000"/>
@@ -1917,7 +1887,7 @@
           </w:tcPr>
           <w:p>
             <w:pPr>
-              <w:pStyle w:val="Ttulodelatabla"/>
+              <w:pStyle w:val="Ttulodelatablauser"/>
               <w:bidi w:val="0"/>
               <w:spacing w:lineRule="atLeast" w:line="375"/>
               <w:ind w:hanging="0" w:start="0" w:end="0"/>
@@ -1951,16 +1921,16 @@
         <w:trPr/>
         <w:tc>
           <w:tcPr>
-            <w:tcW w:w="1757" w:type="dxa"/>
-            <w:tcBorders>
-              <w:start w:val="single" w:sz="2" w:space="0" w:color="000000"/>
-              <w:bottom w:val="single" w:sz="2" w:space="0" w:color="000000"/>
-            </w:tcBorders>
-            <w:vAlign w:val="center"/>
-          </w:tcPr>
-          <w:p>
-            <w:pPr>
-              <w:pStyle w:val="Contenidodelatabla"/>
+            <w:tcW w:w="1756" w:type="dxa"/>
+            <w:tcBorders>
+              <w:start w:val="single" w:sz="2" w:space="0" w:color="000000"/>
+              <w:bottom w:val="single" w:sz="2" w:space="0" w:color="000000"/>
+            </w:tcBorders>
+            <w:vAlign w:val="center"/>
+          </w:tcPr>
+          <w:p>
+            <w:pPr>
+              <w:pStyle w:val="Contenidodelatablauser"/>
               <w:bidi w:val="0"/>
               <w:spacing w:lineRule="atLeast" w:line="375"/>
               <w:ind w:hanging="0" w:start="0" w:end="0"/>
@@ -1984,7 +1954,7 @@
         </w:tc>
         <w:tc>
           <w:tcPr>
-            <w:tcW w:w="7603" w:type="dxa"/>
+            <w:tcW w:w="7604" w:type="dxa"/>
             <w:tcBorders>
               <w:start w:val="single" w:sz="2" w:space="0" w:color="000000"/>
               <w:bottom w:val="single" w:sz="2" w:space="0" w:color="000000"/>
@@ -1994,7 +1964,7 @@
           </w:tcPr>
           <w:p>
             <w:pPr>
-              <w:pStyle w:val="Contenidodelatabla"/>
+              <w:pStyle w:val="Contenidodelatablauser"/>
               <w:bidi w:val="0"/>
               <w:spacing w:lineRule="atLeast" w:line="375"/>
               <w:ind w:hanging="0" w:start="0" w:end="0"/>
@@ -2028,16 +1998,16 @@
         <w:trPr/>
         <w:tc>
           <w:tcPr>
-            <w:tcW w:w="1757" w:type="dxa"/>
-            <w:tcBorders>
-              <w:start w:val="single" w:sz="2" w:space="0" w:color="000000"/>
-              <w:bottom w:val="single" w:sz="2" w:space="0" w:color="000000"/>
-            </w:tcBorders>
-            <w:vAlign w:val="center"/>
-          </w:tcPr>
-          <w:p>
-            <w:pPr>
-              <w:pStyle w:val="Contenidodelatabla"/>
+            <w:tcW w:w="1756" w:type="dxa"/>
+            <w:tcBorders>
+              <w:start w:val="single" w:sz="2" w:space="0" w:color="000000"/>
+              <w:bottom w:val="single" w:sz="2" w:space="0" w:color="000000"/>
+            </w:tcBorders>
+            <w:vAlign w:val="center"/>
+          </w:tcPr>
+          <w:p>
+            <w:pPr>
+              <w:pStyle w:val="Contenidodelatablauser"/>
               <w:bidi w:val="0"/>
               <w:spacing w:lineRule="atLeast" w:line="375"/>
               <w:ind w:hanging="0" w:start="0" w:end="0"/>
@@ -2061,7 +2031,7 @@
         </w:tc>
         <w:tc>
           <w:tcPr>
-            <w:tcW w:w="7603" w:type="dxa"/>
+            <w:tcW w:w="7604" w:type="dxa"/>
             <w:tcBorders>
               <w:start w:val="single" w:sz="2" w:space="0" w:color="000000"/>
               <w:bottom w:val="single" w:sz="2" w:space="0" w:color="000000"/>
@@ -2071,7 +2041,7 @@
           </w:tcPr>
           <w:p>
             <w:pPr>
-              <w:pStyle w:val="Contenidodelatabla"/>
+              <w:pStyle w:val="Contenidodelatablauser"/>
               <w:bidi w:val="0"/>
               <w:spacing w:lineRule="atLeast" w:line="375"/>
               <w:ind w:hanging="0" w:start="0" w:end="0"/>
@@ -2122,16 +2092,16 @@
         <w:trPr/>
         <w:tc>
           <w:tcPr>
-            <w:tcW w:w="1757" w:type="dxa"/>
-            <w:tcBorders>
-              <w:start w:val="single" w:sz="2" w:space="0" w:color="000000"/>
-              <w:bottom w:val="single" w:sz="2" w:space="0" w:color="000000"/>
-            </w:tcBorders>
-            <w:vAlign w:val="center"/>
-          </w:tcPr>
-          <w:p>
-            <w:pPr>
-              <w:pStyle w:val="Contenidodelatabla"/>
+            <w:tcW w:w="1756" w:type="dxa"/>
+            <w:tcBorders>
+              <w:start w:val="single" w:sz="2" w:space="0" w:color="000000"/>
+              <w:bottom w:val="single" w:sz="2" w:space="0" w:color="000000"/>
+            </w:tcBorders>
+            <w:vAlign w:val="center"/>
+          </w:tcPr>
+          <w:p>
+            <w:pPr>
+              <w:pStyle w:val="Contenidodelatablauser"/>
               <w:bidi w:val="0"/>
               <w:spacing w:lineRule="atLeast" w:line="375"/>
               <w:ind w:hanging="0" w:start="0" w:end="0"/>
@@ -2155,7 +2125,7 @@
         </w:tc>
         <w:tc>
           <w:tcPr>
-            <w:tcW w:w="7603" w:type="dxa"/>
+            <w:tcW w:w="7604" w:type="dxa"/>
             <w:tcBorders>
               <w:start w:val="single" w:sz="2" w:space="0" w:color="000000"/>
               <w:bottom w:val="single" w:sz="2" w:space="0" w:color="000000"/>
@@ -2165,7 +2135,7 @@
           </w:tcPr>
           <w:p>
             <w:pPr>
-              <w:pStyle w:val="Contenidodelatabla"/>
+              <w:pStyle w:val="Contenidodelatablauser"/>
               <w:bidi w:val="0"/>
               <w:spacing w:lineRule="atLeast" w:line="375"/>
               <w:ind w:hanging="0" w:start="0" w:end="0"/>
@@ -2199,16 +2169,16 @@
         <w:trPr/>
         <w:tc>
           <w:tcPr>
-            <w:tcW w:w="1757" w:type="dxa"/>
-            <w:tcBorders>
-              <w:start w:val="single" w:sz="2" w:space="0" w:color="000000"/>
-              <w:bottom w:val="single" w:sz="2" w:space="0" w:color="000000"/>
-            </w:tcBorders>
-            <w:vAlign w:val="center"/>
-          </w:tcPr>
-          <w:p>
-            <w:pPr>
-              <w:pStyle w:val="Contenidodelatabla"/>
+            <w:tcW w:w="1756" w:type="dxa"/>
+            <w:tcBorders>
+              <w:start w:val="single" w:sz="2" w:space="0" w:color="000000"/>
+              <w:bottom w:val="single" w:sz="2" w:space="0" w:color="000000"/>
+            </w:tcBorders>
+            <w:vAlign w:val="center"/>
+          </w:tcPr>
+          <w:p>
+            <w:pPr>
+              <w:pStyle w:val="Contenidodelatablauser"/>
               <w:bidi w:val="0"/>
               <w:spacing w:lineRule="atLeast" w:line="375"/>
               <w:ind w:hanging="0" w:start="0" w:end="0"/>
@@ -2232,7 +2202,7 @@
         </w:tc>
         <w:tc>
           <w:tcPr>
-            <w:tcW w:w="7603" w:type="dxa"/>
+            <w:tcW w:w="7604" w:type="dxa"/>
             <w:tcBorders>
               <w:start w:val="single" w:sz="2" w:space="0" w:color="000000"/>
               <w:bottom w:val="single" w:sz="2" w:space="0" w:color="000000"/>
@@ -2242,7 +2212,7 @@
           </w:tcPr>
           <w:p>
             <w:pPr>
-              <w:pStyle w:val="Contenidodelatabla"/>
+              <w:pStyle w:val="Contenidodelatablauser"/>
               <w:bidi w:val="0"/>
               <w:spacing w:lineRule="atLeast" w:line="375"/>
               <w:ind w:hanging="0" w:start="0" w:end="0"/>
@@ -2281,16 +2251,16 @@
         <w:trPr/>
         <w:tc>
           <w:tcPr>
-            <w:tcW w:w="1757" w:type="dxa"/>
-            <w:tcBorders>
-              <w:start w:val="single" w:sz="2" w:space="0" w:color="000000"/>
-              <w:bottom w:val="single" w:sz="2" w:space="0" w:color="000000"/>
-            </w:tcBorders>
-            <w:vAlign w:val="center"/>
-          </w:tcPr>
-          <w:p>
-            <w:pPr>
-              <w:pStyle w:val="Contenidodelatabla"/>
+            <w:tcW w:w="1756" w:type="dxa"/>
+            <w:tcBorders>
+              <w:start w:val="single" w:sz="2" w:space="0" w:color="000000"/>
+              <w:bottom w:val="single" w:sz="2" w:space="0" w:color="000000"/>
+            </w:tcBorders>
+            <w:vAlign w:val="center"/>
+          </w:tcPr>
+          <w:p>
+            <w:pPr>
+              <w:pStyle w:val="Contenidodelatablauser"/>
               <w:bidi w:val="0"/>
               <w:spacing w:lineRule="atLeast" w:line="375"/>
               <w:ind w:hanging="0" w:start="0" w:end="0"/>
@@ -2314,7 +2284,7 @@
         </w:tc>
         <w:tc>
           <w:tcPr>
-            <w:tcW w:w="7603" w:type="dxa"/>
+            <w:tcW w:w="7604" w:type="dxa"/>
             <w:tcBorders>
               <w:start w:val="single" w:sz="2" w:space="0" w:color="000000"/>
               <w:bottom w:val="single" w:sz="2" w:space="0" w:color="000000"/>
@@ -2324,7 +2294,7 @@
           </w:tcPr>
           <w:p>
             <w:pPr>
-              <w:pStyle w:val="Contenidodelatabla"/>
+              <w:pStyle w:val="Contenidodelatablauser"/>
               <w:bidi w:val="0"/>
               <w:spacing w:lineRule="atLeast" w:line="375"/>
               <w:jc w:val="start"/>
@@ -2417,7 +2387,7 @@
           </w:tcPr>
           <w:p>
             <w:pPr>
-              <w:pStyle w:val="Ttulodelatabla"/>
+              <w:pStyle w:val="Ttulodelatablauser"/>
               <w:bidi w:val="0"/>
               <w:spacing w:lineRule="atLeast" w:line="375"/>
               <w:ind w:hanging="0" w:start="0" w:end="0"/>
@@ -2460,7 +2430,7 @@
           </w:tcPr>
           <w:p>
             <w:pPr>
-              <w:pStyle w:val="Ttulodelatabla"/>
+              <w:pStyle w:val="Ttulodelatablauser"/>
               <w:bidi w:val="0"/>
               <w:spacing w:lineRule="atLeast" w:line="375"/>
               <w:ind w:hanging="0" w:start="0" w:end="0"/>
@@ -2503,7 +2473,7 @@
           </w:tcPr>
           <w:p>
             <w:pPr>
-              <w:pStyle w:val="Contenidodelatabla"/>
+              <w:pStyle w:val="Contenidodelatablauser"/>
               <w:bidi w:val="0"/>
               <w:spacing w:lineRule="atLeast" w:line="375"/>
               <w:ind w:hanging="0" w:start="0" w:end="0"/>
@@ -2537,7 +2507,7 @@
           </w:tcPr>
           <w:p>
             <w:pPr>
-              <w:pStyle w:val="Contenidodelatabla"/>
+              <w:pStyle w:val="Contenidodelatablauser"/>
               <w:bidi w:val="0"/>
               <w:spacing w:lineRule="atLeast" w:line="375"/>
               <w:ind w:hanging="0" w:start="0" w:end="0"/>
@@ -2580,7 +2550,7 @@
           </w:tcPr>
           <w:p>
             <w:pPr>
-              <w:pStyle w:val="Contenidodelatabla"/>
+              <w:pStyle w:val="Contenidodelatablauser"/>
               <w:bidi w:val="0"/>
               <w:spacing w:lineRule="atLeast" w:line="375"/>
               <w:ind w:hanging="0" w:start="0" w:end="0"/>
@@ -2614,7 +2584,7 @@
           </w:tcPr>
           <w:p>
             <w:pPr>
-              <w:pStyle w:val="Contenidodelatabla"/>
+              <w:pStyle w:val="Contenidodelatablauser"/>
               <w:bidi w:val="0"/>
               <w:spacing w:lineRule="atLeast" w:line="375"/>
               <w:ind w:hanging="0" w:start="0" w:end="0"/>
@@ -2674,7 +2644,7 @@
           </w:tcPr>
           <w:p>
             <w:pPr>
-              <w:pStyle w:val="Contenidodelatabla"/>
+              <w:pStyle w:val="Contenidodelatablauser"/>
               <w:bidi w:val="0"/>
               <w:spacing w:lineRule="atLeast" w:line="375"/>
               <w:ind w:hanging="0" w:start="0" w:end="0"/>
@@ -2708,7 +2678,7 @@
           </w:tcPr>
           <w:p>
             <w:pPr>
-              <w:pStyle w:val="Contenidodelatabla"/>
+              <w:pStyle w:val="Contenidodelatablauser"/>
               <w:bidi w:val="0"/>
               <w:spacing w:lineRule="atLeast" w:line="375"/>
               <w:ind w:hanging="0" w:start="0" w:end="0"/>
@@ -2751,7 +2721,7 @@
           </w:tcPr>
           <w:p>
             <w:pPr>
-              <w:pStyle w:val="Contenidodelatabla"/>
+              <w:pStyle w:val="Contenidodelatablauser"/>
               <w:bidi w:val="0"/>
               <w:spacing w:lineRule="atLeast" w:line="375"/>
               <w:ind w:hanging="0" w:start="0" w:end="0"/>
@@ -2785,7 +2755,7 @@
           </w:tcPr>
           <w:p>
             <w:pPr>
-              <w:pStyle w:val="Contenidodelatabla"/>
+              <w:pStyle w:val="Contenidodelatablauser"/>
               <w:bidi w:val="0"/>
               <w:spacing w:lineRule="atLeast" w:line="375"/>
               <w:ind w:hanging="0" w:start="0" w:end="0"/>
@@ -2833,7 +2803,7 @@
           </w:tcPr>
           <w:p>
             <w:pPr>
-              <w:pStyle w:val="Contenidodelatabla"/>
+              <w:pStyle w:val="Contenidodelatablauser"/>
               <w:bidi w:val="0"/>
               <w:spacing w:lineRule="atLeast" w:line="375"/>
               <w:ind w:hanging="0" w:start="0" w:end="0"/>
@@ -2867,7 +2837,7 @@
           </w:tcPr>
           <w:p>
             <w:pPr>
-              <w:pStyle w:val="Citaenbloqueuser"/>
+              <w:pStyle w:val="Citaenbloque"/>
               <w:widowControl/>
               <w:suppressAutoHyphens w:val="true"/>
               <w:bidi w:val="0"/>
@@ -3030,7 +3000,7 @@
           </w:tcPr>
           <w:p>
             <w:pPr>
-              <w:pStyle w:val="Ttulodelatabla"/>
+              <w:pStyle w:val="Ttulodelatablauser"/>
               <w:bidi w:val="0"/>
               <w:spacing w:lineRule="atLeast" w:line="375"/>
               <w:ind w:hanging="0" w:start="0" w:end="0"/>
@@ -3073,7 +3043,7 @@
           </w:tcPr>
           <w:p>
             <w:pPr>
-              <w:pStyle w:val="Ttulodelatabla"/>
+              <w:pStyle w:val="Ttulodelatablauser"/>
               <w:bidi w:val="0"/>
               <w:spacing w:lineRule="atLeast" w:line="375"/>
               <w:ind w:hanging="0" w:start="0" w:end="0"/>
@@ -3116,7 +3086,7 @@
           </w:tcPr>
           <w:p>
             <w:pPr>
-              <w:pStyle w:val="Contenidodelatabla"/>
+              <w:pStyle w:val="Contenidodelatablauser"/>
               <w:bidi w:val="0"/>
               <w:spacing w:lineRule="atLeast" w:line="375"/>
               <w:ind w:hanging="0" w:start="0" w:end="0"/>
@@ -3150,7 +3120,7 @@
           </w:tcPr>
           <w:p>
             <w:pPr>
-              <w:pStyle w:val="Contenidodelatabla"/>
+              <w:pStyle w:val="Contenidodelatablauser"/>
               <w:bidi w:val="0"/>
               <w:spacing w:lineRule="atLeast" w:line="375"/>
               <w:ind w:hanging="0" w:start="0" w:end="0"/>
@@ -3193,7 +3163,7 @@
           </w:tcPr>
           <w:p>
             <w:pPr>
-              <w:pStyle w:val="Contenidodelatabla"/>
+              <w:pStyle w:val="Contenidodelatablauser"/>
               <w:bidi w:val="0"/>
               <w:spacing w:lineRule="atLeast" w:line="375"/>
               <w:ind w:hanging="0" w:start="0" w:end="0"/>
@@ -3227,7 +3197,7 @@
           </w:tcPr>
           <w:p>
             <w:pPr>
-              <w:pStyle w:val="Contenidodelatabla"/>
+              <w:pStyle w:val="Contenidodelatablauser"/>
               <w:bidi w:val="0"/>
               <w:spacing w:lineRule="atLeast" w:line="375"/>
               <w:ind w:hanging="0" w:start="0" w:end="0"/>
@@ -3287,7 +3257,7 @@
           </w:tcPr>
           <w:p>
             <w:pPr>
-              <w:pStyle w:val="Contenidodelatabla"/>
+              <w:pStyle w:val="Contenidodelatablauser"/>
               <w:bidi w:val="0"/>
               <w:spacing w:lineRule="atLeast" w:line="375"/>
               <w:ind w:hanging="0" w:start="0" w:end="0"/>
@@ -3321,7 +3291,7 @@
           </w:tcPr>
           <w:p>
             <w:pPr>
-              <w:pStyle w:val="Contenidodelatabla"/>
+              <w:pStyle w:val="Contenidodelatablauser"/>
               <w:bidi w:val="0"/>
               <w:spacing w:lineRule="atLeast" w:line="375"/>
               <w:ind w:hanging="0" w:start="0" w:end="0"/>
@@ -3364,7 +3334,7 @@
           </w:tcPr>
           <w:p>
             <w:pPr>
-              <w:pStyle w:val="Contenidodelatabla"/>
+              <w:pStyle w:val="Contenidodelatablauser"/>
               <w:bidi w:val="0"/>
               <w:spacing w:lineRule="atLeast" w:line="375"/>
               <w:ind w:hanging="0" w:start="0" w:end="0"/>
@@ -3398,7 +3368,7 @@
           </w:tcPr>
           <w:p>
             <w:pPr>
-              <w:pStyle w:val="Contenidodelatabla"/>
+              <w:pStyle w:val="Contenidodelatablauser"/>
               <w:bidi w:val="0"/>
               <w:spacing w:lineRule="atLeast" w:line="375"/>
               <w:ind w:hanging="0" w:start="0" w:end="0"/>
@@ -3434,7 +3404,7 @@
           </w:tcPr>
           <w:p>
             <w:pPr>
-              <w:pStyle w:val="Contenidodelatabla"/>
+              <w:pStyle w:val="Contenidodelatablauser"/>
               <w:bidi w:val="0"/>
               <w:spacing w:lineRule="atLeast" w:line="375"/>
               <w:ind w:hanging="0" w:start="0" w:end="0"/>
@@ -3468,7 +3438,7 @@
           </w:tcPr>
           <w:p>
             <w:pPr>
-              <w:pStyle w:val="Contenidodelatabla"/>
+              <w:pStyle w:val="Contenidodelatablauser"/>
               <w:bidi w:val="0"/>
               <w:spacing w:lineRule="atLeast" w:line="375"/>
               <w:jc w:val="start"/>
@@ -3561,7 +3531,7 @@
           </w:tcPr>
           <w:p>
             <w:pPr>
-              <w:pStyle w:val="Ttulodelatabla"/>
+              <w:pStyle w:val="Ttulodelatablauser"/>
               <w:bidi w:val="0"/>
               <w:spacing w:lineRule="atLeast" w:line="375"/>
               <w:ind w:hanging="0" w:start="0" w:end="0"/>
@@ -3604,7 +3574,7 @@
           </w:tcPr>
           <w:p>
             <w:pPr>
-              <w:pStyle w:val="Ttulodelatabla"/>
+              <w:pStyle w:val="Ttulodelatablauser"/>
               <w:bidi w:val="0"/>
               <w:spacing w:lineRule="atLeast" w:line="375"/>
               <w:ind w:hanging="0" w:start="0" w:end="0"/>
@@ -3647,7 +3617,7 @@
           </w:tcPr>
           <w:p>
             <w:pPr>
-              <w:pStyle w:val="Contenidodelatabla"/>
+              <w:pStyle w:val="Contenidodelatablauser"/>
               <w:bidi w:val="0"/>
               <w:spacing w:lineRule="atLeast" w:line="375"/>
               <w:ind w:hanging="0" w:start="0" w:end="0"/>
@@ -3681,7 +3651,7 @@
           </w:tcPr>
           <w:p>
             <w:pPr>
-              <w:pStyle w:val="Contenidodelatabla"/>
+              <w:pStyle w:val="Contenidodelatablauser"/>
               <w:bidi w:val="0"/>
               <w:spacing w:lineRule="atLeast" w:line="375"/>
               <w:ind w:hanging="0" w:start="0" w:end="0"/>
@@ -3724,7 +3694,7 @@
           </w:tcPr>
           <w:p>
             <w:pPr>
-              <w:pStyle w:val="Contenidodelatabla"/>
+              <w:pStyle w:val="Contenidodelatablauser"/>
               <w:bidi w:val="0"/>
               <w:spacing w:lineRule="atLeast" w:line="375"/>
               <w:ind w:hanging="0" w:start="0" w:end="0"/>
@@ -3758,7 +3728,7 @@
           </w:tcPr>
           <w:p>
             <w:pPr>
-              <w:pStyle w:val="Contenidodelatabla"/>
+              <w:pStyle w:val="Contenidodelatablauser"/>
               <w:bidi w:val="0"/>
               <w:spacing w:lineRule="atLeast" w:line="375"/>
               <w:ind w:hanging="0" w:start="0" w:end="0"/>
@@ -3818,7 +3788,7 @@
           </w:tcPr>
           <w:p>
             <w:pPr>
-              <w:pStyle w:val="Contenidodelatabla"/>
+              <w:pStyle w:val="Contenidodelatablauser"/>
               <w:bidi w:val="0"/>
               <w:spacing w:lineRule="atLeast" w:line="375"/>
               <w:ind w:hanging="0" w:start="0" w:end="0"/>
@@ -3852,7 +3822,7 @@
           </w:tcPr>
           <w:p>
             <w:pPr>
-              <w:pStyle w:val="Contenidodelatabla"/>
+              <w:pStyle w:val="Contenidodelatablauser"/>
               <w:bidi w:val="0"/>
               <w:spacing w:lineRule="atLeast" w:line="375"/>
               <w:ind w:hanging="0" w:start="0" w:end="0"/>
@@ -3895,7 +3865,7 @@
           </w:tcPr>
           <w:p>
             <w:pPr>
-              <w:pStyle w:val="Contenidodelatabla"/>
+              <w:pStyle w:val="Contenidodelatablauser"/>
               <w:bidi w:val="0"/>
               <w:spacing w:lineRule="atLeast" w:line="375"/>
               <w:ind w:hanging="0" w:start="0" w:end="0"/>
@@ -3929,7 +3899,7 @@
           </w:tcPr>
           <w:p>
             <w:pPr>
-              <w:pStyle w:val="Contenidodelatabla"/>
+              <w:pStyle w:val="Contenidodelatablauser"/>
               <w:bidi w:val="0"/>
               <w:spacing w:lineRule="atLeast" w:line="375"/>
               <w:ind w:hanging="0" w:start="0" w:end="0"/>
@@ -3965,7 +3935,7 @@
           </w:tcPr>
           <w:p>
             <w:pPr>
-              <w:pStyle w:val="Contenidodelatabla"/>
+              <w:pStyle w:val="Contenidodelatablauser"/>
               <w:bidi w:val="0"/>
               <w:spacing w:lineRule="atLeast" w:line="375"/>
               <w:ind w:hanging="0" w:start="0" w:end="0"/>
@@ -3999,7 +3969,7 @@
           </w:tcPr>
           <w:p>
             <w:pPr>
-              <w:pStyle w:val="Contenidodelatabla"/>
+              <w:pStyle w:val="Contenidodelatablauser"/>
               <w:bidi w:val="0"/>
               <w:spacing w:lineRule="atLeast" w:line="375"/>
               <w:jc w:val="start"/>
@@ -4092,7 +4062,7 @@
           </w:tcPr>
           <w:p>
             <w:pPr>
-              <w:pStyle w:val="Ttulodelatabla"/>
+              <w:pStyle w:val="Ttulodelatablauser"/>
               <w:bidi w:val="0"/>
               <w:spacing w:lineRule="atLeast" w:line="375"/>
               <w:ind w:hanging="0" w:start="0" w:end="0"/>
@@ -4135,7 +4105,7 @@
           </w:tcPr>
           <w:p>
             <w:pPr>
-              <w:pStyle w:val="Ttulodelatabla"/>
+              <w:pStyle w:val="Ttulodelatablauser"/>
               <w:bidi w:val="0"/>
               <w:spacing w:lineRule="atLeast" w:line="375"/>
               <w:ind w:hanging="0" w:start="0" w:end="0"/>
@@ -4178,7 +4148,7 @@
           </w:tcPr>
           <w:p>
             <w:pPr>
-              <w:pStyle w:val="Contenidodelatabla"/>
+              <w:pStyle w:val="Contenidodelatablauser"/>
               <w:bidi w:val="0"/>
               <w:spacing w:lineRule="atLeast" w:line="375"/>
               <w:ind w:hanging="0" w:start="0" w:end="0"/>
@@ -4212,7 +4182,7 @@
           </w:tcPr>
           <w:p>
             <w:pPr>
-              <w:pStyle w:val="Contenidodelatabla"/>
+              <w:pStyle w:val="Contenidodelatablauser"/>
               <w:bidi w:val="0"/>
               <w:spacing w:lineRule="atLeast" w:line="375"/>
               <w:ind w:hanging="0" w:start="0" w:end="0"/>
@@ -4255,7 +4225,7 @@
           </w:tcPr>
           <w:p>
             <w:pPr>
-              <w:pStyle w:val="Contenidodelatabla"/>
+              <w:pStyle w:val="Contenidodelatablauser"/>
               <w:bidi w:val="0"/>
               <w:spacing w:lineRule="atLeast" w:line="375"/>
               <w:ind w:hanging="0" w:start="0" w:end="0"/>
@@ -4289,7 +4259,7 @@
           </w:tcPr>
           <w:p>
             <w:pPr>
-              <w:pStyle w:val="Contenidodelatabla"/>
+              <w:pStyle w:val="Contenidodelatablauser"/>
               <w:bidi w:val="0"/>
               <w:spacing w:lineRule="atLeast" w:line="375"/>
               <w:ind w:hanging="0" w:start="0" w:end="0"/>
@@ -4349,7 +4319,7 @@
           </w:tcPr>
           <w:p>
             <w:pPr>
-              <w:pStyle w:val="Contenidodelatabla"/>
+              <w:pStyle w:val="Contenidodelatablauser"/>
               <w:bidi w:val="0"/>
               <w:spacing w:lineRule="atLeast" w:line="375"/>
               <w:ind w:hanging="0" w:start="0" w:end="0"/>
@@ -4383,7 +4353,7 @@
           </w:tcPr>
           <w:p>
             <w:pPr>
-              <w:pStyle w:val="Contenidodelatabla"/>
+              <w:pStyle w:val="Contenidodelatablauser"/>
               <w:bidi w:val="0"/>
               <w:spacing w:lineRule="atLeast" w:line="375"/>
               <w:ind w:hanging="0" w:start="0" w:end="0"/>
@@ -4426,7 +4396,7 @@
           </w:tcPr>
           <w:p>
             <w:pPr>
-              <w:pStyle w:val="Contenidodelatabla"/>
+              <w:pStyle w:val="Contenidodelatablauser"/>
               <w:bidi w:val="0"/>
               <w:spacing w:lineRule="atLeast" w:line="375"/>
               <w:ind w:hanging="0" w:start="0" w:end="0"/>
@@ -4460,7 +4430,7 @@
           </w:tcPr>
           <w:p>
             <w:pPr>
-              <w:pStyle w:val="Contenidodelatabla"/>
+              <w:pStyle w:val="Contenidodelatablauser"/>
               <w:bidi w:val="0"/>
               <w:spacing w:lineRule="atLeast" w:line="375"/>
               <w:ind w:hanging="0" w:start="0" w:end="0"/>
@@ -4496,7 +4466,7 @@
           </w:tcPr>
           <w:p>
             <w:pPr>
-              <w:pStyle w:val="Contenidodelatabla"/>
+              <w:pStyle w:val="Contenidodelatablauser"/>
               <w:bidi w:val="0"/>
               <w:spacing w:lineRule="atLeast" w:line="375"/>
               <w:ind w:hanging="0" w:start="0" w:end="0"/>
@@ -4530,7 +4500,7 @@
           </w:tcPr>
           <w:p>
             <w:pPr>
-              <w:pStyle w:val="Contenidodelatabla"/>
+              <w:pStyle w:val="Contenidodelatablauser"/>
               <w:bidi w:val="0"/>
               <w:spacing w:lineRule="atLeast" w:line="375"/>
               <w:jc w:val="start"/>
@@ -4623,7 +4593,7 @@
           </w:tcPr>
           <w:p>
             <w:pPr>
-              <w:pStyle w:val="Ttulodelatabla"/>
+              <w:pStyle w:val="Ttulodelatablauser"/>
               <w:bidi w:val="0"/>
               <w:spacing w:lineRule="atLeast" w:line="375"/>
               <w:ind w:hanging="0" w:start="0" w:end="0"/>
@@ -4666,7 +4636,7 @@
           </w:tcPr>
           <w:p>
             <w:pPr>
-              <w:pStyle w:val="Ttulodelatabla"/>
+              <w:pStyle w:val="Ttulodelatablauser"/>
               <w:bidi w:val="0"/>
               <w:spacing w:lineRule="atLeast" w:line="375"/>
               <w:ind w:hanging="0" w:start="0" w:end="0"/>
@@ -4709,7 +4679,7 @@
           </w:tcPr>
           <w:p>
             <w:pPr>
-              <w:pStyle w:val="Contenidodelatabla"/>
+              <w:pStyle w:val="Contenidodelatablauser"/>
               <w:bidi w:val="0"/>
               <w:spacing w:lineRule="atLeast" w:line="375"/>
               <w:ind w:hanging="0" w:start="0" w:end="0"/>
@@ -4743,7 +4713,7 @@
           </w:tcPr>
           <w:p>
             <w:pPr>
-              <w:pStyle w:val="Contenidodelatabla"/>
+              <w:pStyle w:val="Contenidodelatablauser"/>
               <w:bidi w:val="0"/>
               <w:spacing w:lineRule="atLeast" w:line="375"/>
               <w:ind w:hanging="0" w:start="0" w:end="0"/>
@@ -4786,7 +4756,7 @@
           </w:tcPr>
           <w:p>
             <w:pPr>
-              <w:pStyle w:val="Contenidodelatabla"/>
+              <w:pStyle w:val="Contenidodelatablauser"/>
               <w:bidi w:val="0"/>
               <w:spacing w:lineRule="atLeast" w:line="375"/>
               <w:ind w:hanging="0" w:start="0" w:end="0"/>
@@ -4820,7 +4790,7 @@
           </w:tcPr>
           <w:p>
             <w:pPr>
-              <w:pStyle w:val="Contenidodelatabla"/>
+              <w:pStyle w:val="Contenidodelatablauser"/>
               <w:bidi w:val="0"/>
               <w:spacing w:lineRule="atLeast" w:line="375"/>
               <w:ind w:hanging="0" w:start="0" w:end="0"/>
@@ -4930,7 +4900,7 @@
           </w:tcPr>
           <w:p>
             <w:pPr>
-              <w:pStyle w:val="Contenidodelatabla"/>
+              <w:pStyle w:val="Contenidodelatablauser"/>
               <w:bidi w:val="0"/>
               <w:spacing w:lineRule="atLeast" w:line="375"/>
               <w:ind w:hanging="0" w:start="0" w:end="0"/>
@@ -4964,7 +4934,7 @@
           </w:tcPr>
           <w:p>
             <w:pPr>
-              <w:pStyle w:val="Contenidodelatabla"/>
+              <w:pStyle w:val="Contenidodelatablauser"/>
               <w:bidi w:val="0"/>
               <w:spacing w:lineRule="atLeast" w:line="375"/>
               <w:ind w:hanging="0" w:start="0" w:end="0"/>
@@ -5007,7 +4977,7 @@
           </w:tcPr>
           <w:p>
             <w:pPr>
-              <w:pStyle w:val="Contenidodelatabla"/>
+              <w:pStyle w:val="Contenidodelatablauser"/>
               <w:bidi w:val="0"/>
               <w:spacing w:lineRule="atLeast" w:line="375"/>
               <w:ind w:hanging="0" w:start="0" w:end="0"/>
@@ -5041,7 +5011,7 @@
           </w:tcPr>
           <w:p>
             <w:pPr>
-              <w:pStyle w:val="Contenidodelatabla"/>
+              <w:pStyle w:val="Contenidodelatablauser"/>
               <w:bidi w:val="0"/>
               <w:spacing w:lineRule="atLeast" w:line="375"/>
               <w:ind w:hanging="0" w:start="0" w:end="0"/>
@@ -5089,7 +5059,7 @@
           </w:tcPr>
           <w:p>
             <w:pPr>
-              <w:pStyle w:val="Contenidodelatabla"/>
+              <w:pStyle w:val="Contenidodelatablauser"/>
               <w:bidi w:val="0"/>
               <w:spacing w:lineRule="atLeast" w:line="375"/>
               <w:ind w:hanging="0" w:start="0" w:end="0"/>
@@ -5123,7 +5093,7 @@
           </w:tcPr>
           <w:p>
             <w:pPr>
-              <w:pStyle w:val="Contenidodelatabla"/>
+              <w:pStyle w:val="Contenidodelatablauser"/>
               <w:bidi w:val="0"/>
               <w:spacing w:lineRule="atLeast" w:line="375"/>
               <w:jc w:val="start"/>
@@ -5216,7 +5186,7 @@
           </w:tcPr>
           <w:p>
             <w:pPr>
-              <w:pStyle w:val="Ttulodelatabla"/>
+              <w:pStyle w:val="Ttulodelatablauser"/>
               <w:bidi w:val="0"/>
               <w:spacing w:lineRule="atLeast" w:line="375"/>
               <w:ind w:hanging="0" w:start="0" w:end="0"/>
@@ -5259,7 +5229,7 @@
           </w:tcPr>
           <w:p>
             <w:pPr>
-              <w:pStyle w:val="Ttulodelatabla"/>
+              <w:pStyle w:val="Ttulodelatablauser"/>
               <w:bidi w:val="0"/>
               <w:spacing w:lineRule="atLeast" w:line="375"/>
               <w:ind w:hanging="0" w:start="0" w:end="0"/>
@@ -5302,7 +5272,7 @@
           </w:tcPr>
           <w:p>
             <w:pPr>
-              <w:pStyle w:val="Contenidodelatabla"/>
+              <w:pStyle w:val="Contenidodelatablauser"/>
               <w:bidi w:val="0"/>
               <w:spacing w:lineRule="atLeast" w:line="375"/>
               <w:ind w:hanging="0" w:start="0" w:end="0"/>
@@ -5336,7 +5306,7 @@
           </w:tcPr>
           <w:p>
             <w:pPr>
-              <w:pStyle w:val="Contenidodelatabla"/>
+              <w:pStyle w:val="Contenidodelatablauser"/>
               <w:bidi w:val="0"/>
               <w:spacing w:lineRule="atLeast" w:line="375"/>
               <w:ind w:hanging="0" w:start="0" w:end="0"/>
@@ -5379,7 +5349,7 @@
           </w:tcPr>
           <w:p>
             <w:pPr>
-              <w:pStyle w:val="Contenidodelatabla"/>
+              <w:pStyle w:val="Contenidodelatablauser"/>
               <w:bidi w:val="0"/>
               <w:spacing w:lineRule="atLeast" w:line="375"/>
               <w:ind w:hanging="0" w:start="0" w:end="0"/>
@@ -5413,7 +5383,7 @@
           </w:tcPr>
           <w:p>
             <w:pPr>
-              <w:pStyle w:val="Contenidodelatabla"/>
+              <w:pStyle w:val="Contenidodelatablauser"/>
               <w:bidi w:val="0"/>
               <w:spacing w:lineRule="atLeast" w:line="375"/>
               <w:ind w:hanging="0" w:start="0" w:end="0"/>
@@ -5473,7 +5443,7 @@
           </w:tcPr>
           <w:p>
             <w:pPr>
-              <w:pStyle w:val="Contenidodelatabla"/>
+              <w:pStyle w:val="Contenidodelatablauser"/>
               <w:bidi w:val="0"/>
               <w:spacing w:lineRule="atLeast" w:line="375"/>
               <w:ind w:hanging="0" w:start="0" w:end="0"/>
@@ -5507,7 +5477,7 @@
           </w:tcPr>
           <w:p>
             <w:pPr>
-              <w:pStyle w:val="Contenidodelatabla"/>
+              <w:pStyle w:val="Contenidodelatablauser"/>
               <w:bidi w:val="0"/>
               <w:spacing w:lineRule="atLeast" w:line="375"/>
               <w:ind w:hanging="0" w:start="0" w:end="0"/>
@@ -5550,7 +5520,7 @@
           </w:tcPr>
           <w:p>
             <w:pPr>
-              <w:pStyle w:val="Contenidodelatabla"/>
+              <w:pStyle w:val="Contenidodelatablauser"/>
               <w:bidi w:val="0"/>
               <w:spacing w:lineRule="atLeast" w:line="375"/>
               <w:ind w:hanging="0" w:start="0" w:end="0"/>
@@ -5584,7 +5554,7 @@
           </w:tcPr>
           <w:p>
             <w:pPr>
-              <w:pStyle w:val="Contenidodelatabla"/>
+              <w:pStyle w:val="Contenidodelatablauser"/>
               <w:bidi w:val="0"/>
               <w:spacing w:lineRule="atLeast" w:line="375"/>
               <w:ind w:hanging="0" w:start="0" w:end="0"/>
@@ -5632,7 +5602,7 @@
           </w:tcPr>
           <w:p>
             <w:pPr>
-              <w:pStyle w:val="Contenidodelatabla"/>
+              <w:pStyle w:val="Contenidodelatablauser"/>
               <w:bidi w:val="0"/>
               <w:spacing w:lineRule="atLeast" w:line="375"/>
               <w:ind w:hanging="0" w:start="0" w:end="0"/>
@@ -5666,7 +5636,7 @@
           </w:tcPr>
           <w:p>
             <w:pPr>
-              <w:pStyle w:val="Contenidodelatabla"/>
+              <w:pStyle w:val="Contenidodelatablauser"/>
               <w:bidi w:val="0"/>
               <w:spacing w:lineRule="atLeast" w:line="375"/>
               <w:jc w:val="start"/>
@@ -5771,7 +5741,7 @@
           </w:tcPr>
           <w:p>
             <w:pPr>
-              <w:pStyle w:val="Ttulodelatabla"/>
+              <w:pStyle w:val="Ttulodelatablauser"/>
               <w:bidi w:val="0"/>
               <w:spacing w:lineRule="atLeast" w:line="375"/>
               <w:ind w:hanging="0" w:start="0" w:end="0"/>
@@ -5814,7 +5784,7 @@
           </w:tcPr>
           <w:p>
             <w:pPr>
-              <w:pStyle w:val="Ttulodelatabla"/>
+              <w:pStyle w:val="Ttulodelatablauser"/>
               <w:bidi w:val="0"/>
               <w:spacing w:lineRule="atLeast" w:line="375"/>
               <w:ind w:hanging="0" w:start="0" w:end="0"/>
@@ -5857,7 +5827,7 @@
           </w:tcPr>
           <w:p>
             <w:pPr>
-              <w:pStyle w:val="Contenidodelatabla"/>
+              <w:pStyle w:val="Contenidodelatablauser"/>
               <w:bidi w:val="0"/>
               <w:spacing w:lineRule="atLeast" w:line="375"/>
               <w:ind w:hanging="0" w:start="0" w:end="0"/>
@@ -5892,7 +5862,7 @@
           </w:tcPr>
           <w:p>
             <w:pPr>
-              <w:pStyle w:val="Contenidodelatabla"/>
+              <w:pStyle w:val="Contenidodelatablauser"/>
               <w:bidi w:val="0"/>
               <w:spacing w:lineRule="atLeast" w:line="375"/>
               <w:ind w:hanging="0" w:start="0" w:end="0"/>
@@ -5931,7 +5901,7 @@
           </w:tcPr>
           <w:p>
             <w:pPr>
-              <w:pStyle w:val="Contenidodelatabla"/>
+              <w:pStyle w:val="Contenidodelatablauser"/>
               <w:bidi w:val="0"/>
               <w:spacing w:lineRule="atLeast" w:line="375"/>
               <w:ind w:hanging="0" w:start="0" w:end="0"/>
@@ -5966,7 +5936,7 @@
           </w:tcPr>
           <w:p>
             <w:pPr>
-              <w:pStyle w:val="Contenidodelatabla"/>
+              <w:pStyle w:val="Contenidodelatablauser"/>
               <w:bidi w:val="0"/>
               <w:spacing w:lineRule="atLeast" w:line="375"/>
               <w:ind w:hanging="0" w:start="0" w:end="0"/>
@@ -6005,7 +5975,7 @@
           </w:tcPr>
           <w:p>
             <w:pPr>
-              <w:pStyle w:val="Contenidodelatabla"/>
+              <w:pStyle w:val="Contenidodelatablauser"/>
               <w:bidi w:val="0"/>
               <w:spacing w:lineRule="atLeast" w:line="375"/>
               <w:ind w:hanging="0" w:start="0" w:end="0"/>
@@ -6040,7 +6010,7 @@
           </w:tcPr>
           <w:p>
             <w:pPr>
-              <w:pStyle w:val="Contenidodelatabla"/>
+              <w:pStyle w:val="Contenidodelatablauser"/>
               <w:bidi w:val="0"/>
               <w:spacing w:lineRule="atLeast" w:line="375"/>
               <w:ind w:hanging="0" w:start="0" w:end="0"/>
@@ -6154,7 +6124,7 @@
           </w:tcPr>
           <w:p>
             <w:pPr>
-              <w:pStyle w:val="Contenidodelatabla"/>
+              <w:pStyle w:val="Contenidodelatablauser"/>
               <w:bidi w:val="0"/>
               <w:spacing w:lineRule="atLeast" w:line="375"/>
               <w:ind w:hanging="0" w:start="0" w:end="0"/>
@@ -6189,7 +6159,7 @@
           </w:tcPr>
           <w:p>
             <w:pPr>
-              <w:pStyle w:val="Contenidodelatabla"/>
+              <w:pStyle w:val="Contenidodelatablauser"/>
               <w:bidi w:val="0"/>
               <w:spacing w:lineRule="atLeast" w:line="375"/>
               <w:ind w:hanging="0" w:start="0" w:end="0"/>
@@ -6252,7 +6222,7 @@
           </w:tcPr>
           <w:p>
             <w:pPr>
-              <w:pStyle w:val="Contenidodelatabla"/>
+              <w:pStyle w:val="Contenidodelatablauser"/>
               <w:bidi w:val="0"/>
               <w:spacing w:lineRule="atLeast" w:line="375"/>
               <w:ind w:hanging="0" w:start="0" w:end="0"/>
@@ -6287,7 +6257,7 @@
           </w:tcPr>
           <w:p>
             <w:pPr>
-              <w:pStyle w:val="Contenidodelatabla"/>
+              <w:pStyle w:val="Contenidodelatablauser"/>
               <w:bidi w:val="0"/>
               <w:spacing w:lineRule="atLeast" w:line="375"/>
               <w:ind w:hanging="0" w:start="0" w:end="0"/>
@@ -6386,7 +6356,7 @@
           </w:tcPr>
           <w:p>
             <w:pPr>
-              <w:pStyle w:val="Contenidodelatabla"/>
+              <w:pStyle w:val="Contenidodelatablauser"/>
               <w:bidi w:val="0"/>
               <w:spacing w:lineRule="atLeast" w:line="375"/>
               <w:ind w:hanging="0" w:start="0" w:end="0"/>
@@ -6421,7 +6391,7 @@
           </w:tcPr>
           <w:p>
             <w:pPr>
-              <w:pStyle w:val="Contenidodelatabla"/>
+              <w:pStyle w:val="Contenidodelatablauser"/>
               <w:bidi w:val="0"/>
               <w:spacing w:lineRule="atLeast" w:line="375"/>
               <w:jc w:val="start"/>
@@ -6844,8 +6814,8 @@
         </w:tblCellMar>
       </w:tblPr>
       <w:tblGrid>
-        <w:gridCol w:w="1816"/>
-        <w:gridCol w:w="5214"/>
+        <w:gridCol w:w="1815"/>
+        <w:gridCol w:w="5215"/>
         <w:gridCol w:w="2330"/>
       </w:tblGrid>
       <w:tr>
@@ -6854,7 +6824,7 @@
         </w:trPr>
         <w:tc>
           <w:tcPr>
-            <w:tcW w:w="1816" w:type="dxa"/>
+            <w:tcW w:w="1815" w:type="dxa"/>
             <w:tcBorders>
               <w:top w:val="single" w:sz="2" w:space="0" w:color="000000"/>
               <w:start w:val="single" w:sz="2" w:space="0" w:color="000000"/>
@@ -6865,7 +6835,7 @@
           </w:tcPr>
           <w:p>
             <w:pPr>
-              <w:pStyle w:val="Ttulodelatabla"/>
+              <w:pStyle w:val="Ttulodelatablauser"/>
               <w:bidi w:val="0"/>
               <w:spacing w:lineRule="atLeast" w:line="375"/>
               <w:ind w:hanging="0" w:start="0" w:end="0"/>
@@ -6896,7 +6866,7 @@
         </w:tc>
         <w:tc>
           <w:tcPr>
-            <w:tcW w:w="5214" w:type="dxa"/>
+            <w:tcW w:w="5215" w:type="dxa"/>
             <w:tcBorders>
               <w:top w:val="single" w:sz="2" w:space="0" w:color="000000"/>
               <w:start w:val="single" w:sz="2" w:space="0" w:color="000000"/>
@@ -6907,7 +6877,7 @@
           </w:tcPr>
           <w:p>
             <w:pPr>
-              <w:pStyle w:val="Ttulodelatabla"/>
+              <w:pStyle w:val="Ttulodelatablauser"/>
               <w:bidi w:val="0"/>
               <w:spacing w:lineRule="atLeast" w:line="375"/>
               <w:ind w:hanging="0" w:start="0" w:end="0"/>
@@ -6950,7 +6920,7 @@
           </w:tcPr>
           <w:p>
             <w:pPr>
-              <w:pStyle w:val="Ttulodelatabla"/>
+              <w:pStyle w:val="Ttulodelatablauser"/>
               <w:bidi w:val="0"/>
               <w:spacing w:lineRule="atLeast" w:line="375"/>
               <w:ind w:hanging="0" w:start="0" w:end="0"/>
@@ -6984,16 +6954,16 @@
         <w:trPr/>
         <w:tc>
           <w:tcPr>
-            <w:tcW w:w="1816" w:type="dxa"/>
-            <w:tcBorders>
-              <w:start w:val="single" w:sz="2" w:space="0" w:color="000000"/>
-              <w:bottom w:val="single" w:sz="2" w:space="0" w:color="000000"/>
-            </w:tcBorders>
-            <w:vAlign w:val="center"/>
-          </w:tcPr>
-          <w:p>
-            <w:pPr>
-              <w:pStyle w:val="Contenidodelatabla"/>
+            <w:tcW w:w="1815" w:type="dxa"/>
+            <w:tcBorders>
+              <w:start w:val="single" w:sz="2" w:space="0" w:color="000000"/>
+              <w:bottom w:val="single" w:sz="2" w:space="0" w:color="000000"/>
+            </w:tcBorders>
+            <w:vAlign w:val="center"/>
+          </w:tcPr>
+          <w:p>
+            <w:pPr>
+              <w:pStyle w:val="Contenidodelatablauser"/>
               <w:bidi w:val="0"/>
               <w:spacing w:lineRule="atLeast" w:line="375"/>
               <w:ind w:hanging="0" w:start="0" w:end="0"/>
@@ -7017,16 +6987,16 @@
         </w:tc>
         <w:tc>
           <w:tcPr>
-            <w:tcW w:w="5214" w:type="dxa"/>
-            <w:tcBorders>
-              <w:start w:val="single" w:sz="2" w:space="0" w:color="000000"/>
-              <w:bottom w:val="single" w:sz="2" w:space="0" w:color="000000"/>
-            </w:tcBorders>
-            <w:vAlign w:val="center"/>
-          </w:tcPr>
-          <w:p>
-            <w:pPr>
-              <w:pStyle w:val="Contenidodelatabla"/>
+            <w:tcW w:w="5215" w:type="dxa"/>
+            <w:tcBorders>
+              <w:start w:val="single" w:sz="2" w:space="0" w:color="000000"/>
+              <w:bottom w:val="single" w:sz="2" w:space="0" w:color="000000"/>
+            </w:tcBorders>
+            <w:vAlign w:val="center"/>
+          </w:tcPr>
+          <w:p>
+            <w:pPr>
+              <w:pStyle w:val="Contenidodelatablauser"/>
               <w:bidi w:val="0"/>
               <w:spacing w:lineRule="atLeast" w:line="330"/>
               <w:ind w:hanging="0" w:start="0" w:end="0"/>
@@ -7048,7 +7018,7 @@
             </w:r>
             <w:r>
               <w:rPr>
-                <w:rStyle w:val="Textooriginal"/>
+                <w:rStyle w:val="Textooriginaluser"/>
                 <w:rFonts w:ascii="Arial" w:hAnsi="Arial"/>
                 <w:sz w:val="22"/>
                 <w:szCs w:val="22"/>
@@ -7067,7 +7037,7 @@
             </w:r>
             <w:r>
               <w:rPr>
-                <w:rStyle w:val="Textooriginal"/>
+                <w:rStyle w:val="Textooriginaluser"/>
                 <w:rFonts w:ascii="Arial" w:hAnsi="Arial"/>
                 <w:sz w:val="22"/>
                 <w:szCs w:val="22"/>
@@ -7102,7 +7072,7 @@
           </w:tcPr>
           <w:p>
             <w:pPr>
-              <w:pStyle w:val="Contenidodelatabla"/>
+              <w:pStyle w:val="Contenidodelatablauser"/>
               <w:bidi w:val="0"/>
               <w:spacing w:lineRule="atLeast" w:line="375"/>
               <w:ind w:hanging="0" w:start="0" w:end="0"/>
@@ -7136,16 +7106,16 @@
         <w:trPr/>
         <w:tc>
           <w:tcPr>
-            <w:tcW w:w="1816" w:type="dxa"/>
-            <w:tcBorders>
-              <w:start w:val="single" w:sz="2" w:space="0" w:color="000000"/>
-              <w:bottom w:val="single" w:sz="2" w:space="0" w:color="000000"/>
-            </w:tcBorders>
-            <w:vAlign w:val="center"/>
-          </w:tcPr>
-          <w:p>
-            <w:pPr>
-              <w:pStyle w:val="Contenidodelatabla"/>
+            <w:tcW w:w="1815" w:type="dxa"/>
+            <w:tcBorders>
+              <w:start w:val="single" w:sz="2" w:space="0" w:color="000000"/>
+              <w:bottom w:val="single" w:sz="2" w:space="0" w:color="000000"/>
+            </w:tcBorders>
+            <w:vAlign w:val="center"/>
+          </w:tcPr>
+          <w:p>
+            <w:pPr>
+              <w:pStyle w:val="Contenidodelatablauser"/>
               <w:bidi w:val="0"/>
               <w:spacing w:lineRule="atLeast" w:line="375"/>
               <w:ind w:hanging="0" w:start="0" w:end="0"/>
@@ -7169,16 +7139,16 @@
         </w:tc>
         <w:tc>
           <w:tcPr>
-            <w:tcW w:w="5214" w:type="dxa"/>
-            <w:tcBorders>
-              <w:start w:val="single" w:sz="2" w:space="0" w:color="000000"/>
-              <w:bottom w:val="single" w:sz="2" w:space="0" w:color="000000"/>
-            </w:tcBorders>
-            <w:vAlign w:val="center"/>
-          </w:tcPr>
-          <w:p>
-            <w:pPr>
-              <w:pStyle w:val="Contenidodelatabla"/>
+            <w:tcW w:w="5215" w:type="dxa"/>
+            <w:tcBorders>
+              <w:start w:val="single" w:sz="2" w:space="0" w:color="000000"/>
+              <w:bottom w:val="single" w:sz="2" w:space="0" w:color="000000"/>
+            </w:tcBorders>
+            <w:vAlign w:val="center"/>
+          </w:tcPr>
+          <w:p>
+            <w:pPr>
+              <w:pStyle w:val="Contenidodelatablauser"/>
               <w:bidi w:val="0"/>
               <w:spacing w:lineRule="atLeast" w:line="375"/>
               <w:ind w:hanging="0" w:start="0" w:end="0"/>
@@ -7222,7 +7192,7 @@
           </w:tcPr>
           <w:p>
             <w:pPr>
-              <w:pStyle w:val="Contenidodelatabla"/>
+              <w:pStyle w:val="Contenidodelatablauser"/>
               <w:bidi w:val="0"/>
               <w:spacing w:lineRule="atLeast" w:line="375"/>
               <w:ind w:hanging="0" w:start="0" w:end="0"/>
@@ -7256,16 +7226,16 @@
         <w:trPr/>
         <w:tc>
           <w:tcPr>
-            <w:tcW w:w="1816" w:type="dxa"/>
-            <w:tcBorders>
-              <w:start w:val="single" w:sz="2" w:space="0" w:color="000000"/>
-              <w:bottom w:val="single" w:sz="2" w:space="0" w:color="000000"/>
-            </w:tcBorders>
-            <w:vAlign w:val="center"/>
-          </w:tcPr>
-          <w:p>
-            <w:pPr>
-              <w:pStyle w:val="Contenidodelatabla"/>
+            <w:tcW w:w="1815" w:type="dxa"/>
+            <w:tcBorders>
+              <w:start w:val="single" w:sz="2" w:space="0" w:color="000000"/>
+              <w:bottom w:val="single" w:sz="2" w:space="0" w:color="000000"/>
+            </w:tcBorders>
+            <w:vAlign w:val="center"/>
+          </w:tcPr>
+          <w:p>
+            <w:pPr>
+              <w:pStyle w:val="Contenidodelatablauser"/>
               <w:bidi w:val="0"/>
               <w:spacing w:lineRule="atLeast" w:line="375"/>
               <w:ind w:hanging="0" w:start="0" w:end="0"/>
@@ -7289,16 +7259,16 @@
         </w:tc>
         <w:tc>
           <w:tcPr>
-            <w:tcW w:w="5214" w:type="dxa"/>
-            <w:tcBorders>
-              <w:start w:val="single" w:sz="2" w:space="0" w:color="000000"/>
-              <w:bottom w:val="single" w:sz="2" w:space="0" w:color="000000"/>
-            </w:tcBorders>
-            <w:vAlign w:val="center"/>
-          </w:tcPr>
-          <w:p>
-            <w:pPr>
-              <w:pStyle w:val="Contenidodelatabla"/>
+            <w:tcW w:w="5215" w:type="dxa"/>
+            <w:tcBorders>
+              <w:start w:val="single" w:sz="2" w:space="0" w:color="000000"/>
+              <w:bottom w:val="single" w:sz="2" w:space="0" w:color="000000"/>
+            </w:tcBorders>
+            <w:vAlign w:val="center"/>
+          </w:tcPr>
+          <w:p>
+            <w:pPr>
+              <w:pStyle w:val="Contenidodelatablauser"/>
               <w:bidi w:val="0"/>
               <w:spacing w:lineRule="auto" w:line="276"/>
               <w:jc w:val="start"/>
@@ -7315,7 +7285,7 @@
             </w:r>
             <w:r>
               <w:rPr>
-                <w:rStyle w:val="Textooriginal"/>
+                <w:rStyle w:val="Textooriginaluser"/>
                 <w:rFonts w:ascii="Arial" w:hAnsi="Arial"/>
                 <w:sz w:val="22"/>
                 <w:szCs w:val="22"/>
@@ -7334,7 +7304,7 @@
             </w:r>
             <w:r>
               <w:rPr>
-                <w:rStyle w:val="Textooriginal"/>
+                <w:rStyle w:val="Textooriginaluser"/>
                 <w:rFonts w:ascii="Arial" w:hAnsi="Arial"/>
                 <w:sz w:val="22"/>
                 <w:szCs w:val="22"/>
@@ -7365,7 +7335,7 @@
           </w:tcPr>
           <w:p>
             <w:pPr>
-              <w:pStyle w:val="Contenidodelatabla"/>
+              <w:pStyle w:val="Contenidodelatablauser"/>
               <w:bidi w:val="0"/>
               <w:spacing w:lineRule="atLeast" w:line="375"/>
               <w:ind w:hanging="0" w:start="0" w:end="0"/>
@@ -7466,7 +7436,7 @@
           </w:tcPr>
           <w:p>
             <w:pPr>
-              <w:pStyle w:val="Ttulodelatabla"/>
+              <w:pStyle w:val="Ttulodelatablauser"/>
               <w:bidi w:val="0"/>
               <w:spacing w:lineRule="atLeast" w:line="375"/>
               <w:ind w:hanging="0" w:start="0" w:end="0"/>
@@ -7508,7 +7478,7 @@
           </w:tcPr>
           <w:p>
             <w:pPr>
-              <w:pStyle w:val="Ttulodelatabla"/>
+              <w:pStyle w:val="Ttulodelatablauser"/>
               <w:bidi w:val="0"/>
               <w:spacing w:lineRule="atLeast" w:line="375"/>
               <w:ind w:hanging="0" w:start="0" w:end="0"/>
@@ -7551,7 +7521,7 @@
           </w:tcPr>
           <w:p>
             <w:pPr>
-              <w:pStyle w:val="Ttulodelatabla"/>
+              <w:pStyle w:val="Ttulodelatablauser"/>
               <w:bidi w:val="0"/>
               <w:spacing w:lineRule="atLeast" w:line="375"/>
               <w:ind w:hanging="0" w:start="0" w:end="0"/>
@@ -7594,7 +7564,7 @@
           </w:tcPr>
           <w:p>
             <w:pPr>
-              <w:pStyle w:val="Contenidodelatabla"/>
+              <w:pStyle w:val="Contenidodelatablauser"/>
               <w:bidi w:val="0"/>
               <w:spacing w:lineRule="atLeast" w:line="375"/>
               <w:ind w:hanging="0" w:start="0" w:end="0"/>
@@ -7627,7 +7597,7 @@
           </w:tcPr>
           <w:p>
             <w:pPr>
-              <w:pStyle w:val="Contenidodelatabla"/>
+              <w:pStyle w:val="Contenidodelatablauser"/>
               <w:bidi w:val="0"/>
               <w:spacing w:lineRule="atLeast" w:line="375"/>
               <w:ind w:hanging="0" w:start="0" w:end="0"/>
@@ -7668,7 +7638,7 @@
           </w:tcPr>
           <w:p>
             <w:pPr>
-              <w:pStyle w:val="Contenidodelatabla"/>
+              <w:pStyle w:val="Contenidodelatablauser"/>
               <w:bidi w:val="0"/>
               <w:spacing w:lineRule="atLeast" w:line="375"/>
               <w:ind w:hanging="0" w:start="0" w:end="0"/>
@@ -7711,7 +7681,7 @@
           </w:tcPr>
           <w:p>
             <w:pPr>
-              <w:pStyle w:val="Contenidodelatabla"/>
+              <w:pStyle w:val="Contenidodelatablauser"/>
               <w:bidi w:val="0"/>
               <w:spacing w:lineRule="atLeast" w:line="375"/>
               <w:ind w:hanging="0" w:start="0" w:end="0"/>
@@ -7744,7 +7714,7 @@
           </w:tcPr>
           <w:p>
             <w:pPr>
-              <w:pStyle w:val="Contenidodelatabla"/>
+              <w:pStyle w:val="Contenidodelatablauser"/>
               <w:bidi w:val="0"/>
               <w:spacing w:lineRule="atLeast" w:line="375"/>
               <w:ind w:hanging="0" w:start="0" w:end="0"/>
@@ -7785,7 +7755,7 @@
           </w:tcPr>
           <w:p>
             <w:pPr>
-              <w:pStyle w:val="Contenidodelatabla"/>
+              <w:pStyle w:val="Contenidodelatablauser"/>
               <w:bidi w:val="0"/>
               <w:spacing w:lineRule="atLeast" w:line="375"/>
               <w:ind w:hanging="0" w:start="0" w:end="0"/>
@@ -7828,7 +7798,7 @@
           </w:tcPr>
           <w:p>
             <w:pPr>
-              <w:pStyle w:val="Contenidodelatabla"/>
+              <w:pStyle w:val="Contenidodelatablauser"/>
               <w:bidi w:val="0"/>
               <w:spacing w:lineRule="atLeast" w:line="375"/>
               <w:ind w:hanging="0" w:start="0" w:end="0"/>
@@ -7861,7 +7831,7 @@
           </w:tcPr>
           <w:p>
             <w:pPr>
-              <w:pStyle w:val="Contenidodelatabla"/>
+              <w:pStyle w:val="Contenidodelatablauser"/>
               <w:bidi w:val="0"/>
               <w:spacing w:lineRule="atLeast" w:line="375"/>
               <w:ind w:hanging="0" w:start="0" w:end="0"/>
@@ -7902,7 +7872,7 @@
           </w:tcPr>
           <w:p>
             <w:pPr>
-              <w:pStyle w:val="Contenidodelatabla"/>
+              <w:pStyle w:val="Contenidodelatablauser"/>
               <w:bidi w:val="0"/>
               <w:spacing w:lineRule="atLeast" w:line="375"/>
               <w:jc w:val="start"/>
@@ -8002,7 +7972,7 @@
           </w:tcPr>
           <w:p>
             <w:pPr>
-              <w:pStyle w:val="Ttulodelatabla"/>
+              <w:pStyle w:val="Ttulodelatablauser"/>
               <w:bidi w:val="0"/>
               <w:spacing w:lineRule="atLeast" w:line="375"/>
               <w:ind w:hanging="0" w:start="0" w:end="0"/>
@@ -8044,7 +8014,7 @@
           </w:tcPr>
           <w:p>
             <w:pPr>
-              <w:pStyle w:val="Ttulodelatabla"/>
+              <w:pStyle w:val="Ttulodelatablauser"/>
               <w:bidi w:val="0"/>
               <w:spacing w:lineRule="atLeast" w:line="375"/>
               <w:ind w:hanging="0" w:start="0" w:end="0"/>
@@ -8087,7 +8057,7 @@
           </w:tcPr>
           <w:p>
             <w:pPr>
-              <w:pStyle w:val="Ttulodelatabla"/>
+              <w:pStyle w:val="Ttulodelatablauser"/>
               <w:bidi w:val="0"/>
               <w:spacing w:lineRule="atLeast" w:line="375"/>
               <w:ind w:hanging="0" w:start="0" w:end="0"/>
@@ -8130,7 +8100,7 @@
           </w:tcPr>
           <w:p>
             <w:pPr>
-              <w:pStyle w:val="Contenidodelatabla"/>
+              <w:pStyle w:val="Contenidodelatablauser"/>
               <w:bidi w:val="0"/>
               <w:spacing w:lineRule="atLeast" w:line="375"/>
               <w:ind w:hanging="0" w:start="0" w:end="0"/>
@@ -8163,7 +8133,7 @@
           </w:tcPr>
           <w:p>
             <w:pPr>
-              <w:pStyle w:val="Contenidodelatabla"/>
+              <w:pStyle w:val="Contenidodelatablauser"/>
               <w:bidi w:val="0"/>
               <w:spacing w:lineRule="atLeast" w:line="375"/>
               <w:ind w:hanging="0" w:start="0" w:end="0"/>
@@ -8204,7 +8174,7 @@
           </w:tcPr>
           <w:p>
             <w:pPr>
-              <w:pStyle w:val="Contenidodelatabla"/>
+              <w:pStyle w:val="Contenidodelatablauser"/>
               <w:bidi w:val="0"/>
               <w:spacing w:lineRule="atLeast" w:line="375"/>
               <w:ind w:hanging="0" w:start="0" w:end="0"/>
@@ -8247,7 +8217,7 @@
           </w:tcPr>
           <w:p>
             <w:pPr>
-              <w:pStyle w:val="Contenidodelatabla"/>
+              <w:pStyle w:val="Contenidodelatablauser"/>
               <w:bidi w:val="0"/>
               <w:spacing w:lineRule="atLeast" w:line="375"/>
               <w:ind w:hanging="0" w:start="0" w:end="0"/>
@@ -8280,7 +8250,7 @@
           </w:tcPr>
           <w:p>
             <w:pPr>
-              <w:pStyle w:val="Contenidodelatabla"/>
+              <w:pStyle w:val="Contenidodelatablauser"/>
               <w:bidi w:val="0"/>
               <w:spacing w:lineRule="atLeast" w:line="375"/>
               <w:ind w:hanging="0" w:start="0" w:end="0"/>
@@ -8321,7 +8291,7 @@
           </w:tcPr>
           <w:p>
             <w:pPr>
-              <w:pStyle w:val="Contenidodelatabla"/>
+              <w:pStyle w:val="Contenidodelatablauser"/>
               <w:bidi w:val="0"/>
               <w:spacing w:lineRule="atLeast" w:line="375"/>
               <w:jc w:val="start"/>
@@ -8428,9 +8398,9 @@
         </w:tblCellMar>
       </w:tblPr>
       <w:tblGrid>
-        <w:gridCol w:w="2153"/>
+        <w:gridCol w:w="2152"/>
         <w:gridCol w:w="3947"/>
-        <w:gridCol w:w="3260"/>
+        <w:gridCol w:w="3261"/>
       </w:tblGrid>
       <w:tr>
         <w:trPr>
@@ -8438,7 +8408,7 @@
         </w:trPr>
         <w:tc>
           <w:tcPr>
-            <w:tcW w:w="2153" w:type="dxa"/>
+            <w:tcW w:w="2152" w:type="dxa"/>
             <w:tcBorders>
               <w:top w:val="single" w:sz="2" w:space="0" w:color="000000"/>
               <w:start w:val="single" w:sz="2" w:space="0" w:color="000000"/>
@@ -8449,7 +8419,7 @@
           </w:tcPr>
           <w:p>
             <w:pPr>
-              <w:pStyle w:val="Ttulodelatabla"/>
+              <w:pStyle w:val="Ttulodelatablauser"/>
               <w:bidi w:val="0"/>
               <w:spacing w:lineRule="atLeast" w:line="375"/>
               <w:ind w:hanging="0" w:start="0" w:end="0"/>
@@ -8491,7 +8461,7 @@
           </w:tcPr>
           <w:p>
             <w:pPr>
-              <w:pStyle w:val="Ttulodelatabla"/>
+              <w:pStyle w:val="Ttulodelatablauser"/>
               <w:bidi w:val="0"/>
               <w:spacing w:lineRule="atLeast" w:line="375"/>
               <w:ind w:hanging="0" w:start="0" w:end="0"/>
@@ -8522,7 +8492,7 @@
         </w:tc>
         <w:tc>
           <w:tcPr>
-            <w:tcW w:w="3260" w:type="dxa"/>
+            <w:tcW w:w="3261" w:type="dxa"/>
             <w:tcBorders>
               <w:top w:val="single" w:sz="2" w:space="0" w:color="000000"/>
               <w:start w:val="single" w:sz="2" w:space="0" w:color="000000"/>
@@ -8534,7 +8504,7 @@
           </w:tcPr>
           <w:p>
             <w:pPr>
-              <w:pStyle w:val="Ttulodelatabla"/>
+              <w:pStyle w:val="Ttulodelatablauser"/>
               <w:bidi w:val="0"/>
               <w:spacing w:lineRule="atLeast" w:line="375"/>
               <w:ind w:hanging="0" w:start="0" w:end="0"/>
@@ -8568,16 +8538,16 @@
         <w:trPr/>
         <w:tc>
           <w:tcPr>
-            <w:tcW w:w="2153" w:type="dxa"/>
-            <w:tcBorders>
-              <w:start w:val="single" w:sz="2" w:space="0" w:color="000000"/>
-              <w:bottom w:val="single" w:sz="2" w:space="0" w:color="000000"/>
-            </w:tcBorders>
-            <w:vAlign w:val="center"/>
-          </w:tcPr>
-          <w:p>
-            <w:pPr>
-              <w:pStyle w:val="Contenidodelatabla"/>
+            <w:tcW w:w="2152" w:type="dxa"/>
+            <w:tcBorders>
+              <w:start w:val="single" w:sz="2" w:space="0" w:color="000000"/>
+              <w:bottom w:val="single" w:sz="2" w:space="0" w:color="000000"/>
+            </w:tcBorders>
+            <w:vAlign w:val="center"/>
+          </w:tcPr>
+          <w:p>
+            <w:pPr>
+              <w:pStyle w:val="Contenidodelatablauser"/>
               <w:bidi w:val="0"/>
               <w:spacing w:lineRule="atLeast" w:line="375"/>
               <w:ind w:hanging="0" w:start="0" w:end="0"/>
@@ -8611,7 +8581,7 @@
           </w:tcPr>
           <w:p>
             <w:pPr>
-              <w:pStyle w:val="Contenidodelatabla"/>
+              <w:pStyle w:val="Contenidodelatablauser"/>
               <w:bidi w:val="0"/>
               <w:spacing w:lineRule="atLeast" w:line="375"/>
               <w:ind w:hanging="0" w:start="0" w:end="0"/>
@@ -8638,7 +8608,7 @@
         </w:tc>
         <w:tc>
           <w:tcPr>
-            <w:tcW w:w="3260" w:type="dxa"/>
+            <w:tcW w:w="3261" w:type="dxa"/>
             <w:tcBorders>
               <w:start w:val="single" w:sz="2" w:space="0" w:color="000000"/>
               <w:bottom w:val="single" w:sz="2" w:space="0" w:color="000000"/>
@@ -8648,7 +8618,7 @@
           </w:tcPr>
           <w:p>
             <w:pPr>
-              <w:pStyle w:val="Contenidodelatabla"/>
+              <w:pStyle w:val="Contenidodelatablauser"/>
               <w:bidi w:val="0"/>
               <w:spacing w:lineRule="atLeast" w:line="375"/>
               <w:ind w:hanging="0" w:start="0" w:end="0"/>
@@ -8678,16 +8648,16 @@
         <w:trPr/>
         <w:tc>
           <w:tcPr>
-            <w:tcW w:w="2153" w:type="dxa"/>
-            <w:tcBorders>
-              <w:start w:val="single" w:sz="2" w:space="0" w:color="000000"/>
-              <w:bottom w:val="single" w:sz="2" w:space="0" w:color="000000"/>
-            </w:tcBorders>
-            <w:vAlign w:val="center"/>
-          </w:tcPr>
-          <w:p>
-            <w:pPr>
-              <w:pStyle w:val="Contenidodelatabla"/>
+            <w:tcW w:w="2152" w:type="dxa"/>
+            <w:tcBorders>
+              <w:start w:val="single" w:sz="2" w:space="0" w:color="000000"/>
+              <w:bottom w:val="single" w:sz="2" w:space="0" w:color="000000"/>
+            </w:tcBorders>
+            <w:vAlign w:val="center"/>
+          </w:tcPr>
+          <w:p>
+            <w:pPr>
+              <w:pStyle w:val="Contenidodelatablauser"/>
               <w:bidi w:val="0"/>
               <w:spacing w:lineRule="atLeast" w:line="375"/>
               <w:ind w:hanging="0" w:start="0" w:end="0"/>
@@ -8721,7 +8691,7 @@
           </w:tcPr>
           <w:p>
             <w:pPr>
-              <w:pStyle w:val="Contenidodelatabla"/>
+              <w:pStyle w:val="Contenidodelatablauser"/>
               <w:bidi w:val="0"/>
               <w:spacing w:lineRule="atLeast" w:line="375"/>
               <w:ind w:hanging="0" w:start="0" w:end="0"/>
@@ -8748,7 +8718,7 @@
         </w:tc>
         <w:tc>
           <w:tcPr>
-            <w:tcW w:w="3260" w:type="dxa"/>
+            <w:tcW w:w="3261" w:type="dxa"/>
             <w:tcBorders>
               <w:start w:val="single" w:sz="2" w:space="0" w:color="000000"/>
               <w:bottom w:val="single" w:sz="2" w:space="0" w:color="000000"/>
@@ -8758,7 +8728,7 @@
           </w:tcPr>
           <w:p>
             <w:pPr>
-              <w:pStyle w:val="Contenidodelatabla"/>
+              <w:pStyle w:val="Contenidodelatablauser"/>
               <w:bidi w:val="0"/>
               <w:spacing w:lineRule="atLeast" w:line="375"/>
               <w:jc w:val="start"/>
@@ -8931,7 +8901,7 @@
           </w:tcPr>
           <w:p>
             <w:pPr>
-              <w:pStyle w:val="Ttulodelatabla"/>
+              <w:pStyle w:val="Ttulodelatablauser"/>
               <w:bidi w:val="0"/>
               <w:spacing w:lineRule="atLeast" w:line="375"/>
               <w:ind w:hanging="0" w:start="0" w:end="0"/>
@@ -8974,7 +8944,7 @@
           </w:tcPr>
           <w:p>
             <w:pPr>
-              <w:pStyle w:val="Ttulodelatabla"/>
+              <w:pStyle w:val="Ttulodelatablauser"/>
               <w:bidi w:val="0"/>
               <w:spacing w:lineRule="atLeast" w:line="375"/>
               <w:ind w:hanging="0" w:start="0" w:end="0"/>
@@ -9017,7 +8987,7 @@
           </w:tcPr>
           <w:p>
             <w:pPr>
-              <w:pStyle w:val="Contenidodelatabla"/>
+              <w:pStyle w:val="Contenidodelatablauser"/>
               <w:bidi w:val="0"/>
               <w:spacing w:lineRule="atLeast" w:line="375"/>
               <w:ind w:hanging="0" w:start="0" w:end="0"/>
@@ -9051,7 +9021,7 @@
           </w:tcPr>
           <w:p>
             <w:pPr>
-              <w:pStyle w:val="Contenidodelatabla"/>
+              <w:pStyle w:val="Contenidodelatablauser"/>
               <w:bidi w:val="0"/>
               <w:spacing w:lineRule="atLeast" w:line="375"/>
               <w:ind w:hanging="0" w:start="0" w:end="0"/>
@@ -9094,7 +9064,7 @@
           </w:tcPr>
           <w:p>
             <w:pPr>
-              <w:pStyle w:val="Contenidodelatabla"/>
+              <w:pStyle w:val="Contenidodelatablauser"/>
               <w:bidi w:val="0"/>
               <w:spacing w:lineRule="atLeast" w:line="375"/>
               <w:ind w:hanging="0" w:start="0" w:end="0"/>
@@ -9128,7 +9098,7 @@
           </w:tcPr>
           <w:p>
             <w:pPr>
-              <w:pStyle w:val="Contenidodelatabla"/>
+              <w:pStyle w:val="Contenidodelatablauser"/>
               <w:bidi w:val="0"/>
               <w:spacing w:lineRule="atLeast" w:line="375"/>
               <w:ind w:hanging="0" w:start="0" w:end="0"/>
@@ -9200,7 +9170,7 @@
           </w:tcPr>
           <w:p>
             <w:pPr>
-              <w:pStyle w:val="Contenidodelatabla"/>
+              <w:pStyle w:val="Contenidodelatablauser"/>
               <w:bidi w:val="0"/>
               <w:spacing w:lineRule="atLeast" w:line="375"/>
               <w:ind w:hanging="0" w:start="0" w:end="0"/>
@@ -9234,7 +9204,7 @@
           </w:tcPr>
           <w:p>
             <w:pPr>
-              <w:pStyle w:val="Contenidodelatabla"/>
+              <w:pStyle w:val="Contenidodelatablauser"/>
               <w:bidi w:val="0"/>
               <w:spacing w:lineRule="atLeast" w:line="375"/>
               <w:ind w:hanging="0" w:start="0" w:end="0"/>
@@ -9277,7 +9247,7 @@
           </w:tcPr>
           <w:p>
             <w:pPr>
-              <w:pStyle w:val="Contenidodelatabla"/>
+              <w:pStyle w:val="Contenidodelatablauser"/>
               <w:bidi w:val="0"/>
               <w:spacing w:lineRule="atLeast" w:line="375"/>
               <w:ind w:hanging="0" w:start="0" w:end="0"/>
@@ -9311,7 +9281,7 @@
           </w:tcPr>
           <w:p>
             <w:pPr>
-              <w:pStyle w:val="Contenidodelatabla"/>
+              <w:pStyle w:val="Contenidodelatablauser"/>
               <w:bidi w:val="0"/>
               <w:spacing w:lineRule="atLeast" w:line="375"/>
               <w:ind w:hanging="0" w:start="0" w:end="0"/>
@@ -9357,7 +9327,7 @@
           </w:tcPr>
           <w:p>
             <w:pPr>
-              <w:pStyle w:val="Contenidodelatabla"/>
+              <w:pStyle w:val="Contenidodelatablauser"/>
               <w:bidi w:val="0"/>
               <w:spacing w:lineRule="atLeast" w:line="375"/>
               <w:ind w:hanging="0" w:start="0" w:end="0"/>
@@ -9391,7 +9361,7 @@
           </w:tcPr>
           <w:p>
             <w:pPr>
-              <w:pStyle w:val="Contenidodelatabla"/>
+              <w:pStyle w:val="Contenidodelatablauser"/>
               <w:bidi w:val="0"/>
               <w:spacing w:lineRule="atLeast" w:line="375"/>
               <w:jc w:val="start"/>
@@ -9565,7 +9535,7 @@
           </w:tcPr>
           <w:p>
             <w:pPr>
-              <w:pStyle w:val="Ttulodelatabla"/>
+              <w:pStyle w:val="Ttulodelatablauser"/>
               <w:bidi w:val="0"/>
               <w:spacing w:lineRule="atLeast" w:line="375"/>
               <w:ind w:hanging="0" w:start="0" w:end="0"/>
@@ -9608,7 +9578,7 @@
           </w:tcPr>
           <w:p>
             <w:pPr>
-              <w:pStyle w:val="Ttulodelatabla"/>
+              <w:pStyle w:val="Ttulodelatablauser"/>
               <w:bidi w:val="0"/>
               <w:spacing w:lineRule="atLeast" w:line="375"/>
               <w:ind w:hanging="0" w:start="0" w:end="0"/>
@@ -9651,7 +9621,7 @@
           </w:tcPr>
           <w:p>
             <w:pPr>
-              <w:pStyle w:val="Contenidodelatabla"/>
+              <w:pStyle w:val="Contenidodelatablauser"/>
               <w:bidi w:val="0"/>
               <w:spacing w:lineRule="atLeast" w:line="375"/>
               <w:ind w:hanging="0" w:start="0" w:end="0"/>
@@ -9685,7 +9655,7 @@
           </w:tcPr>
           <w:p>
             <w:pPr>
-              <w:pStyle w:val="Contenidodelatabla"/>
+              <w:pStyle w:val="Contenidodelatablauser"/>
               <w:bidi w:val="0"/>
               <w:spacing w:lineRule="atLeast" w:line="375"/>
               <w:ind w:hanging="0" w:start="0" w:end="0"/>
@@ -9728,7 +9698,7 @@
           </w:tcPr>
           <w:p>
             <w:pPr>
-              <w:pStyle w:val="Contenidodelatabla"/>
+              <w:pStyle w:val="Contenidodelatablauser"/>
               <w:bidi w:val="0"/>
               <w:spacing w:lineRule="atLeast" w:line="375"/>
               <w:ind w:hanging="0" w:start="0" w:end="0"/>
@@ -9762,7 +9732,7 @@
           </w:tcPr>
           <w:p>
             <w:pPr>
-              <w:pStyle w:val="Contenidodelatabla"/>
+              <w:pStyle w:val="Contenidodelatablauser"/>
               <w:bidi w:val="0"/>
               <w:spacing w:lineRule="atLeast" w:line="375"/>
               <w:ind w:hanging="0" w:start="0" w:end="0"/>
@@ -9906,7 +9876,7 @@
           </w:tcPr>
           <w:p>
             <w:pPr>
-              <w:pStyle w:val="Contenidodelatabla"/>
+              <w:pStyle w:val="Contenidodelatablauser"/>
               <w:bidi w:val="0"/>
               <w:spacing w:lineRule="atLeast" w:line="375"/>
               <w:ind w:hanging="0" w:start="0" w:end="0"/>
@@ -9940,7 +9910,7 @@
           </w:tcPr>
           <w:p>
             <w:pPr>
-              <w:pStyle w:val="Contenidodelatabla"/>
+              <w:pStyle w:val="Contenidodelatablauser"/>
               <w:bidi w:val="0"/>
               <w:spacing w:lineRule="atLeast" w:line="375"/>
               <w:ind w:hanging="0" w:start="0" w:end="0"/>
@@ -9999,7 +9969,7 @@
           </w:tcPr>
           <w:p>
             <w:pPr>
-              <w:pStyle w:val="Contenidodelatabla"/>
+              <w:pStyle w:val="Contenidodelatablauser"/>
               <w:bidi w:val="0"/>
               <w:spacing w:lineRule="atLeast" w:line="375"/>
               <w:ind w:hanging="0" w:start="0" w:end="0"/>
@@ -10033,7 +10003,7 @@
           </w:tcPr>
           <w:p>
             <w:pPr>
-              <w:pStyle w:val="Contenidodelatabla"/>
+              <w:pStyle w:val="Contenidodelatablauser"/>
               <w:bidi w:val="0"/>
               <w:spacing w:lineRule="atLeast" w:line="375"/>
               <w:ind w:hanging="0" w:start="0" w:end="0"/>
@@ -10149,7 +10119,7 @@
           </w:tcPr>
           <w:p>
             <w:pPr>
-              <w:pStyle w:val="Contenidodelatabla"/>
+              <w:pStyle w:val="Contenidodelatablauser"/>
               <w:bidi w:val="0"/>
               <w:spacing w:lineRule="atLeast" w:line="375"/>
               <w:ind w:hanging="0" w:start="0" w:end="0"/>
@@ -10183,7 +10153,7 @@
           </w:tcPr>
           <w:p>
             <w:pPr>
-              <w:pStyle w:val="Contenidodelatabla"/>
+              <w:pStyle w:val="Contenidodelatablauser"/>
               <w:bidi w:val="0"/>
               <w:spacing w:lineRule="atLeast" w:line="375"/>
               <w:jc w:val="start"/>
@@ -10290,7 +10260,7 @@
           </w:tcPr>
           <w:p>
             <w:pPr>
-              <w:pStyle w:val="Ttulodelatablauser"/>
+              <w:pStyle w:val="Ttulodelatabla"/>
               <w:spacing w:lineRule="atLeast" w:line="375"/>
               <w:ind w:hanging="0" w:start="0" w:end="0"/>
               <w:jc w:val="start"/>
@@ -10326,7 +10296,7 @@
           </w:tcPr>
           <w:p>
             <w:pPr>
-              <w:pStyle w:val="Ttulodelatablauser"/>
+              <w:pStyle w:val="Ttulodelatabla"/>
               <w:spacing w:lineRule="atLeast" w:line="375"/>
               <w:ind w:hanging="0" w:start="0" w:end="0"/>
               <w:jc w:val="start"/>
@@ -10363,7 +10333,7 @@
           </w:tcPr>
           <w:p>
             <w:pPr>
-              <w:pStyle w:val="Ttulodelatablauser"/>
+              <w:pStyle w:val="Ttulodelatabla"/>
               <w:spacing w:lineRule="atLeast" w:line="375"/>
               <w:ind w:hanging="0" w:start="0" w:end="0"/>
               <w:jc w:val="start"/>
@@ -10399,7 +10369,7 @@
           </w:tcPr>
           <w:p>
             <w:pPr>
-              <w:pStyle w:val="Ttulodelatablauser"/>
+              <w:pStyle w:val="Ttulodelatabla"/>
               <w:spacing w:lineRule="atLeast" w:line="375"/>
               <w:ind w:hanging="0" w:start="0" w:end="0"/>
               <w:jc w:val="start"/>
@@ -10438,7 +10408,7 @@
           </w:tcPr>
           <w:p>
             <w:pPr>
-              <w:pStyle w:val="Contenidodelatablauser"/>
+              <w:pStyle w:val="Contenidodelatabla"/>
               <w:spacing w:lineRule="atLeast" w:line="375"/>
               <w:ind w:hanging="0" w:start="0" w:end="0"/>
               <w:rPr>
@@ -10473,7 +10443,7 @@
           </w:tcPr>
           <w:p>
             <w:pPr>
-              <w:pStyle w:val="Contenidodelatablauser"/>
+              <w:pStyle w:val="Contenidodelatabla"/>
               <w:spacing w:lineRule="atLeast" w:line="375"/>
               <w:ind w:hanging="0" w:start="0" w:end="0"/>
               <w:rPr>
@@ -10508,7 +10478,7 @@
           </w:tcPr>
           <w:p>
             <w:pPr>
-              <w:pStyle w:val="Contenidodelatablauser"/>
+              <w:pStyle w:val="Contenidodelatabla"/>
               <w:spacing w:lineRule="atLeast" w:line="375"/>
               <w:ind w:hanging="0" w:start="0" w:end="0"/>
               <w:rPr>
@@ -10543,7 +10513,7 @@
           </w:tcPr>
           <w:p>
             <w:pPr>
-              <w:pStyle w:val="Contenidodelatablauser"/>
+              <w:pStyle w:val="Contenidodelatabla"/>
               <w:spacing w:lineRule="atLeast" w:line="375"/>
               <w:ind w:hanging="0" w:start="0" w:end="0"/>
               <w:rPr>
@@ -10577,7 +10547,7 @@
           </w:tcPr>
           <w:p>
             <w:pPr>
-              <w:pStyle w:val="Contenidodelatablauser"/>
+              <w:pStyle w:val="Contenidodelatabla"/>
               <w:spacing w:lineRule="atLeast" w:line="375"/>
               <w:ind w:hanging="0" w:start="0" w:end="0"/>
               <w:rPr>
@@ -10615,7 +10585,7 @@
           </w:tcPr>
           <w:p>
             <w:pPr>
-              <w:pStyle w:val="Contenidodelatablauser"/>
+              <w:pStyle w:val="Contenidodelatabla"/>
               <w:spacing w:lineRule="atLeast" w:line="375"/>
               <w:ind w:hanging="0" w:start="0" w:end="0"/>
               <w:rPr>
@@ -10650,7 +10620,7 @@
           </w:tcPr>
           <w:p>
             <w:pPr>
-              <w:pStyle w:val="Contenidodelatablauser"/>
+              <w:pStyle w:val="Contenidodelatabla"/>
               <w:spacing w:lineRule="atLeast" w:line="375"/>
               <w:ind w:hanging="0" w:start="0" w:end="0"/>
               <w:rPr>
@@ -10685,7 +10655,7 @@
           </w:tcPr>
           <w:p>
             <w:pPr>
-              <w:pStyle w:val="Contenidodelatablauser"/>
+              <w:pStyle w:val="Contenidodelatabla"/>
               <w:spacing w:lineRule="atLeast" w:line="375"/>
               <w:ind w:hanging="0" w:start="0" w:end="0"/>
               <w:rPr>
@@ -10720,7 +10690,7 @@
           </w:tcPr>
           <w:p>
             <w:pPr>
-              <w:pStyle w:val="Contenidodelatablauser"/>
+              <w:pStyle w:val="Contenidodelatabla"/>
               <w:spacing w:lineRule="atLeast" w:line="375"/>
               <w:ind w:hanging="0" w:start="0" w:end="0"/>
               <w:rPr>
@@ -10754,7 +10724,7 @@
           </w:tcPr>
           <w:p>
             <w:pPr>
-              <w:pStyle w:val="Contenidodelatablauser"/>
+              <w:pStyle w:val="Contenidodelatabla"/>
               <w:spacing w:lineRule="atLeast" w:line="375"/>
               <w:ind w:hanging="0" w:start="0" w:end="0"/>
               <w:rPr>
@@ -10792,7 +10762,7 @@
           </w:tcPr>
           <w:p>
             <w:pPr>
-              <w:pStyle w:val="Contenidodelatablauser"/>
+              <w:pStyle w:val="Contenidodelatabla"/>
               <w:spacing w:lineRule="atLeast" w:line="375"/>
               <w:ind w:hanging="0" w:start="0" w:end="0"/>
               <w:rPr>
@@ -10827,7 +10797,7 @@
           </w:tcPr>
           <w:p>
             <w:pPr>
-              <w:pStyle w:val="Contenidodelatablauser"/>
+              <w:pStyle w:val="Contenidodelatabla"/>
               <w:spacing w:lineRule="atLeast" w:line="375"/>
               <w:ind w:hanging="0" w:start="0" w:end="0"/>
               <w:rPr>
@@ -10862,7 +10832,7 @@
           </w:tcPr>
           <w:p>
             <w:pPr>
-              <w:pStyle w:val="Contenidodelatablauser"/>
+              <w:pStyle w:val="Contenidodelatabla"/>
               <w:spacing w:lineRule="atLeast" w:line="375"/>
               <w:ind w:hanging="0" w:start="0" w:end="0"/>
               <w:rPr>
@@ -10897,7 +10867,7 @@
           </w:tcPr>
           <w:p>
             <w:pPr>
-              <w:pStyle w:val="Contenidodelatablauser"/>
+              <w:pStyle w:val="Contenidodelatabla"/>
               <w:spacing w:lineRule="atLeast" w:line="375"/>
               <w:ind w:hanging="0" w:start="0" w:end="0"/>
               <w:rPr>
@@ -10931,7 +10901,7 @@
           </w:tcPr>
           <w:p>
             <w:pPr>
-              <w:pStyle w:val="Contenidodelatablauser"/>
+              <w:pStyle w:val="Contenidodelatabla"/>
               <w:spacing w:lineRule="atLeast" w:line="375"/>
               <w:ind w:hanging="0" w:start="0" w:end="0"/>
               <w:rPr>
@@ -10969,7 +10939,7 @@
           </w:tcPr>
           <w:p>
             <w:pPr>
-              <w:pStyle w:val="Contenidodelatablauser"/>
+              <w:pStyle w:val="Contenidodelatabla"/>
               <w:spacing w:lineRule="atLeast" w:line="375"/>
               <w:ind w:hanging="0" w:start="0" w:end="0"/>
               <w:rPr>
@@ -11004,7 +10974,7 @@
           </w:tcPr>
           <w:p>
             <w:pPr>
-              <w:pStyle w:val="Contenidodelatablauser"/>
+              <w:pStyle w:val="Contenidodelatabla"/>
               <w:spacing w:lineRule="atLeast" w:line="375"/>
               <w:ind w:hanging="0" w:start="0" w:end="0"/>
               <w:rPr>
@@ -11039,7 +11009,7 @@
           </w:tcPr>
           <w:p>
             <w:pPr>
-              <w:pStyle w:val="Contenidodelatablauser"/>
+              <w:pStyle w:val="Contenidodelatabla"/>
               <w:spacing w:lineRule="atLeast" w:line="375"/>
               <w:ind w:hanging="0" w:start="0" w:end="0"/>
               <w:rPr>
@@ -11074,7 +11044,7 @@
           </w:tcPr>
           <w:p>
             <w:pPr>
-              <w:pStyle w:val="Contenidodelatablauser"/>
+              <w:pStyle w:val="Contenidodelatabla"/>
               <w:spacing w:lineRule="atLeast" w:line="375"/>
               <w:ind w:hanging="0" w:start="0" w:end="0"/>
               <w:rPr>
@@ -11108,7 +11078,7 @@
           </w:tcPr>
           <w:p>
             <w:pPr>
-              <w:pStyle w:val="Contenidodelatablauser"/>
+              <w:pStyle w:val="Contenidodelatabla"/>
               <w:spacing w:lineRule="atLeast" w:line="375"/>
               <w:ind w:hanging="0" w:start="0" w:end="0"/>
               <w:rPr>
@@ -11146,7 +11116,7 @@
           </w:tcPr>
           <w:p>
             <w:pPr>
-              <w:pStyle w:val="Contenidodelatablauser"/>
+              <w:pStyle w:val="Contenidodelatabla"/>
               <w:spacing w:lineRule="atLeast" w:line="375"/>
               <w:ind w:hanging="0" w:start="0" w:end="0"/>
               <w:rPr>
@@ -11181,7 +11151,7 @@
           </w:tcPr>
           <w:p>
             <w:pPr>
-              <w:pStyle w:val="Contenidodelatablauser"/>
+              <w:pStyle w:val="Contenidodelatabla"/>
               <w:spacing w:lineRule="atLeast" w:line="375"/>
               <w:ind w:hanging="0" w:start="0" w:end="0"/>
               <w:rPr>
@@ -11216,7 +11186,7 @@
           </w:tcPr>
           <w:p>
             <w:pPr>
-              <w:pStyle w:val="Contenidodelatablauser"/>
+              <w:pStyle w:val="Contenidodelatabla"/>
               <w:spacing w:lineRule="atLeast" w:line="375"/>
               <w:ind w:hanging="0" w:start="0" w:end="0"/>
               <w:rPr>
@@ -11251,7 +11221,7 @@
           </w:tcPr>
           <w:p>
             <w:pPr>
-              <w:pStyle w:val="Contenidodelatablauser"/>
+              <w:pStyle w:val="Contenidodelatabla"/>
               <w:spacing w:lineRule="atLeast" w:line="375"/>
               <w:ind w:hanging="0" w:start="0" w:end="0"/>
               <w:rPr>
@@ -11285,7 +11255,7 @@
           </w:tcPr>
           <w:p>
             <w:pPr>
-              <w:pStyle w:val="Contenidodelatablauser"/>
+              <w:pStyle w:val="Contenidodelatabla"/>
               <w:spacing w:lineRule="atLeast" w:line="375"/>
               <w:rPr>
                 <w:rFonts w:ascii="quote-cjk-patch;Inter;system-ui;apple-system;BlinkMacSystemFont;Segoe UI;Roboto;Oxygen;Ubuntu;Cantarell;Open Sans;Helvetica Neue;sans-serif" w:hAnsi="quote-cjk-patch;Inter;system-ui;apple-system;BlinkMacSystemFont;Segoe UI;Roboto;Oxygen;Ubuntu;Cantarell;Open Sans;Helvetica Neue;sans-serif"/>
@@ -11382,7 +11352,7 @@
   </w:style>
   <w:style w:type="paragraph" w:styleId="Heading2">
     <w:name w:val="heading 2"/>
-    <w:basedOn w:val="Ttulo"/>
+    <w:basedOn w:val="Ttulouser"/>
     <w:next w:val="BodyText"/>
     <w:qFormat/>
     <w:pPr>
@@ -11399,7 +11369,7 @@
   </w:style>
   <w:style w:type="paragraph" w:styleId="Heading3">
     <w:name w:val="heading 3"/>
-    <w:basedOn w:val="Ttulo"/>
+    <w:basedOn w:val="Ttulouser"/>
     <w:next w:val="BodyText"/>
     <w:qFormat/>
     <w:pPr>
@@ -11416,7 +11386,7 @@
   </w:style>
   <w:style w:type="paragraph" w:styleId="Heading4">
     <w:name w:val="heading 4"/>
-    <w:basedOn w:val="Ttulo"/>
+    <w:basedOn w:val="Ttulouser"/>
     <w:next w:val="BodyText"/>
     <w:qFormat/>
     <w:pPr>
@@ -11439,15 +11409,15 @@
       <w:bCs/>
     </w:rPr>
   </w:style>
-  <w:style w:type="character" w:styleId="Textooriginal">
-    <w:name w:val="Texto original"/>
+  <w:style w:type="character" w:styleId="Textooriginaluser">
+    <w:name w:val="Texto original (user)"/>
     <w:qFormat/>
     <w:rPr>
       <w:rFonts w:ascii="Liberation Mono" w:hAnsi="Liberation Mono" w:eastAsia="NSimSun" w:cs="Liberation Mono"/>
     </w:rPr>
   </w:style>
-  <w:style w:type="character" w:styleId="Bolos">
-    <w:name w:val="Bolos"/>
+  <w:style w:type="character" w:styleId="Bolosuser">
+    <w:name w:val="Bolos (user)"/>
     <w:qFormat/>
     <w:rPr>
       <w:rFonts w:ascii="OpenSymbol" w:hAnsi="OpenSymbol" w:eastAsia="OpenSymbol" w:cs="OpenSymbol"/>
@@ -11545,8 +11515,8 @@
       <w:rFonts w:cs="Lucida Sans"/>
     </w:rPr>
   </w:style>
-  <w:style w:type="paragraph" w:styleId="Lneahorizontal">
-    <w:name w:val="Línea horizontal"/>
+  <w:style w:type="paragraph" w:styleId="Lneahorizontaluser">
+    <w:name w:val="Línea horizontal (user)"/>
     <w:basedOn w:val="Normal"/>
     <w:next w:val="BodyText"/>
     <w:qFormat/>
@@ -11560,6 +11530,29 @@
     <w:rPr>
       <w:sz w:val="12"/>
       <w:szCs w:val="12"/>
+    </w:rPr>
+  </w:style>
+  <w:style w:type="paragraph" w:styleId="Contenidodelatablauser">
+    <w:name w:val="Contenido de la tabla (user)"/>
+    <w:basedOn w:val="Normal"/>
+    <w:qFormat/>
+    <w:pPr>
+      <w:widowControl w:val="false"/>
+      <w:suppressLineNumbers/>
+    </w:pPr>
+    <w:rPr/>
+  </w:style>
+  <w:style w:type="paragraph" w:styleId="Ttulodelatablauser">
+    <w:name w:val="Título de la tabla (user)"/>
+    <w:basedOn w:val="Contenidodelatablauser"/>
+    <w:qFormat/>
+    <w:pPr>
+      <w:suppressLineNumbers/>
+      <w:jc w:val="center"/>
+    </w:pPr>
+    <w:rPr>
+      <w:b/>
+      <w:bCs/>
     </w:rPr>
   </w:style>
   <w:style w:type="paragraph" w:styleId="Contenidodelatabla">
@@ -11585,31 +11578,8 @@
       <w:bCs/>
     </w:rPr>
   </w:style>
-  <w:style w:type="paragraph" w:styleId="Contenidodelatablauser">
-    <w:name w:val="Contenido de la tabla (user)"/>
-    <w:basedOn w:val="Normal"/>
-    <w:qFormat/>
-    <w:pPr>
-      <w:widowControl w:val="false"/>
-      <w:suppressLineNumbers/>
-    </w:pPr>
-    <w:rPr/>
-  </w:style>
-  <w:style w:type="paragraph" w:styleId="Ttulodelatablauser">
-    <w:name w:val="Título de la tabla (user)"/>
-    <w:basedOn w:val="Contenidodelatablauser"/>
-    <w:qFormat/>
-    <w:pPr>
-      <w:suppressLineNumbers/>
-      <w:jc w:val="center"/>
-    </w:pPr>
-    <w:rPr>
-      <w:b/>
-      <w:bCs/>
-    </w:rPr>
-  </w:style>
-  <w:style w:type="paragraph" w:styleId="Citaenbloqueuser">
-    <w:name w:val="Cita en bloque (user)"/>
+  <w:style w:type="paragraph" w:styleId="Citaenbloque">
+    <w:name w:val="Cita en bloque"/>
     <w:basedOn w:val="Normal"/>
     <w:qFormat/>
     <w:pPr>

</xml_diff>